<commit_message>
Expenditure on consumer goods
</commit_message>
<xml_diff>
--- a/IELTS Notes/Writing Exercises and Analyses.docx
+++ b/IELTS Notes/Writing Exercises and Analyses.docx
@@ -4102,6 +4102,14 @@
         </w:rPr>
         <w:t>My Report</w:t>
       </w:r>
+      <w:r>
+        <w:rPr>
+          <w:rFonts w:ascii="Times New Roman" w:hAnsi="Times New Roman" w:cs="Times New Roman" w:hint="eastAsia"/>
+          <w:b/>
+          <w:i/>
+        </w:rPr>
+        <w:t xml:space="preserve"> 1</w:t>
+      </w:r>
     </w:p>
     <w:p>
       <w:pPr>
@@ -4653,8 +4661,6 @@
         </w:rPr>
         <w:t xml:space="preserve"> of them</w:t>
       </w:r>
-      <w:bookmarkStart w:id="0" w:name="_GoBack"/>
-      <w:bookmarkEnd w:id="0"/>
       <w:r>
         <w:rPr>
           <w:rFonts w:ascii="Times New Roman" w:hAnsi="Times New Roman" w:cs="Times New Roman" w:hint="eastAsia"/>
@@ -4950,7 +4956,7 @@
     <w:p>
       <w:pPr>
         <w:rPr>
-          <w:rFonts w:ascii="Times New Roman" w:hAnsi="Times New Roman" w:cs="Times New Roman"/>
+          <w:rFonts w:ascii="Times New Roman" w:hAnsi="Times New Roman" w:cs="Times New Roman" w:hint="eastAsia"/>
           <w:lang w:val="en-US"/>
         </w:rPr>
       </w:pPr>
@@ -5100,7 +5106,7 @@
     <w:p>
       <w:pPr>
         <w:rPr>
-          <w:rFonts w:ascii="Times New Roman" w:hAnsi="Times New Roman" w:cs="Times New Roman"/>
+          <w:rFonts w:ascii="Times New Roman" w:hAnsi="Times New Roman" w:cs="Times New Roman" w:hint="eastAsia"/>
         </w:rPr>
       </w:pPr>
       <w:r>
@@ -5145,6 +5151,127 @@
           </wp:inline>
         </w:drawing>
       </w:r>
+    </w:p>
+    <w:p>
+      <w:pPr>
+        <w:rPr>
+          <w:rFonts w:ascii="Times New Roman" w:hAnsi="Times New Roman" w:cs="Times New Roman" w:hint="eastAsia"/>
+        </w:rPr>
+      </w:pPr>
+    </w:p>
+    <w:p>
+      <w:pPr>
+        <w:rPr>
+          <w:rFonts w:ascii="Times New Roman" w:hAnsi="Times New Roman" w:cs="Times New Roman" w:hint="eastAsia"/>
+          <w:b/>
+          <w:bCs/>
+          <w:i/>
+          <w:iCs/>
+        </w:rPr>
+      </w:pPr>
+      <w:r>
+        <w:rPr>
+          <w:rFonts w:ascii="Times New Roman" w:hAnsi="Times New Roman" w:cs="Times New Roman" w:hint="eastAsia"/>
+          <w:b/>
+          <w:bCs/>
+          <w:i/>
+          <w:iCs/>
+        </w:rPr>
+        <w:t>My Report 2</w:t>
+      </w:r>
+      <w:r>
+        <w:rPr>
+          <w:rFonts w:ascii="Times New Roman" w:hAnsi="Times New Roman" w:cs="Times New Roman" w:hint="eastAsia"/>
+          <w:b/>
+          <w:bCs/>
+          <w:i/>
+          <w:iCs/>
+        </w:rPr>
+        <w:t xml:space="preserve"> (adopting the first way mentioned in the 4</w:t>
+      </w:r>
+      <w:r>
+        <w:rPr>
+          <w:rFonts w:ascii="Times New Roman" w:hAnsi="Times New Roman" w:cs="Times New Roman" w:hint="eastAsia"/>
+          <w:b/>
+          <w:bCs/>
+          <w:i/>
+          <w:iCs/>
+          <w:vertAlign w:val="superscript"/>
+        </w:rPr>
+        <w:t>th</w:t>
+      </w:r>
+      <w:r>
+        <w:rPr>
+          <w:rFonts w:ascii="Times New Roman" w:hAnsi="Times New Roman" w:cs="Times New Roman" w:hint="eastAsia"/>
+          <w:b/>
+          <w:bCs/>
+          <w:i/>
+          <w:iCs/>
+        </w:rPr>
+        <w:t xml:space="preserve"> note above.)</w:t>
+      </w:r>
+    </w:p>
+    <w:p>
+      <w:pPr>
+        <w:rPr>
+          <w:rFonts w:ascii="Times New Roman" w:hAnsi="Times New Roman" w:cs="Times New Roman"/>
+        </w:rPr>
+      </w:pPr>
+      <w:r>
+        <w:rPr>
+          <w:rFonts w:ascii="Times New Roman" w:hAnsi="Times New Roman" w:cs="Times New Roman"/>
+        </w:rPr>
+        <w:t>The bar chart illustrates the money that British and French spent on cars, computers, books, perfume and cameras in 2010. Units are measured in pound sterling.</w:t>
+      </w:r>
+    </w:p>
+    <w:p>
+      <w:pPr>
+        <w:rPr>
+          <w:rFonts w:ascii="Times New Roman" w:hAnsi="Times New Roman" w:cs="Times New Roman"/>
+        </w:rPr>
+      </w:pPr>
+      <w:r>
+        <w:rPr>
+          <w:rFonts w:ascii="Times New Roman" w:hAnsi="Times New Roman" w:cs="Times New Roman"/>
+        </w:rPr>
+        <w:t xml:space="preserve">Generaly, Britain consumed more than France in total. Both countries spent the most money on cars. Whereas, the least amout of money was spent on perfume in UK  while on camera in France. In addition, the most significant difference between two countries was in the consumption of cameras. </w:t>
+      </w:r>
+    </w:p>
+    <w:p>
+      <w:pPr>
+        <w:rPr>
+          <w:rFonts w:ascii="Times New Roman" w:hAnsi="Times New Roman" w:cs="Times New Roman"/>
+        </w:rPr>
+      </w:pPr>
+      <w:r>
+        <w:rPr>
+          <w:rFonts w:ascii="Times New Roman" w:hAnsi="Times New Roman" w:cs="Times New Roman"/>
+        </w:rPr>
+        <w:lastRenderedPageBreak/>
+        <w:t>In terms of cars, the amount of money spent by British was just over £450,000 and of French was exactly £400,000. Britain spent less than £150,000 on perfume compared £200,000 in France. Whereas ,there was a sharp contrast in the expenditure of cameras; consumers in UK spent a little bit more than £350,000 which was as more than two times as the amount (£150,000) in France.</w:t>
+      </w:r>
+    </w:p>
+    <w:p>
+      <w:pPr>
+        <w:rPr>
+          <w:rFonts w:ascii="Times New Roman" w:hAnsi="Times New Roman" w:cs="Times New Roman"/>
+        </w:rPr>
+      </w:pPr>
+      <w:r>
+        <w:rPr>
+          <w:rFonts w:ascii="Times New Roman" w:hAnsi="Times New Roman" w:cs="Times New Roman"/>
+        </w:rPr>
+        <w:t>For computers, it cost British cosumers about £375,000 and French ones £300,000. People in UK spent around £400,000 on books while those in France spent £300,000.</w:t>
+      </w:r>
+    </w:p>
+    <w:p>
+      <w:pPr>
+        <w:rPr>
+          <w:rFonts w:ascii="Times New Roman" w:hAnsi="Times New Roman" w:cs="Times New Roman"/>
+        </w:rPr>
+      </w:pPr>
+      <w:bookmarkStart w:id="0" w:name="_GoBack"/>
+      <w:bookmarkEnd w:id="0"/>
     </w:p>
     <w:p>
       <w:pPr>
@@ -7499,7 +7626,7 @@
   <a:extraClrSchemeLst/>
   <a:extLst>
     <a:ext uri="{05A4C25C-085E-4340-85A3-A5531E510DB2}">
-      <thm15:themeFamily xmlns:thm15="http://schemas.microsoft.com/office/thememl/2012/main" xmlns="" name="Office Theme" id="{62F939B6-93AF-4DB8-9C6B-D6C7DFDC589F}" vid="{4A3C46E8-61CC-4603-A589-7422A47A8E4A}"/>
+      <thm15:themeFamily xmlns="" xmlns:thm15="http://schemas.microsoft.com/office/thememl/2012/main" name="Office Theme" id="{62F939B6-93AF-4DB8-9C6B-D6C7DFDC589F}" vid="{4A3C46E8-61CC-4603-A589-7422A47A8E4A}"/>
     </a:ext>
   </a:extLst>
 </a:theme>
@@ -7510,7 +7637,7 @@
 </file>
 
 <file path=customXml/itemProps1.xml><?xml version="1.0" encoding="utf-8"?>
-<ds:datastoreItem xmlns:ds="http://schemas.openxmlformats.org/officeDocument/2006/customXml" ds:itemID="{6C1936A9-CADC-4958-9DEE-F5FCEE244F9F}">
+<ds:datastoreItem xmlns:ds="http://schemas.openxmlformats.org/officeDocument/2006/customXml" ds:itemID="{060EAB4A-33A4-4603-9AA2-567F1EC36345}">
   <ds:schemaRefs>
     <ds:schemaRef ds:uri="http://schemas.openxmlformats.org/officeDocument/2006/bibliography"/>
   </ds:schemaRefs>

</xml_diff>

<commit_message>
udpate analyses of wrting
</commit_message>
<xml_diff>
--- a/IELTS Notes/Writing Exercises and Analyses.docx
+++ b/IELTS Notes/Writing Exercises and Analyses.docx
@@ -4301,7 +4301,20 @@
         <w:rPr>
           <w:rFonts w:ascii="Times New Roman" w:hAnsi="Times New Roman" w:cs="Times New Roman" w:hint="eastAsia"/>
         </w:rPr>
-        <w:t xml:space="preserve">people in UK consume more </w:t>
+        <w:t xml:space="preserve">people in UK </w:t>
+      </w:r>
+      <w:r>
+        <w:rPr>
+          <w:rFonts w:ascii="Times New Roman" w:hAnsi="Times New Roman" w:cs="Times New Roman" w:hint="eastAsia"/>
+          <w:highlight w:val="yellow"/>
+        </w:rPr>
+        <w:t>consume</w:t>
+      </w:r>
+      <w:r>
+        <w:rPr>
+          <w:rFonts w:ascii="Times New Roman" w:hAnsi="Times New Roman" w:cs="Times New Roman" w:hint="eastAsia"/>
+        </w:rPr>
+        <w:t xml:space="preserve"> more </w:t>
       </w:r>
       <w:r>
         <w:rPr>
@@ -4465,7 +4478,31 @@
           <w:rFonts w:ascii="Times New Roman" w:hAnsi="Times New Roman" w:cs="Times New Roman" w:hint="eastAsia"/>
         </w:rPr>
         <w:lastRenderedPageBreak/>
-        <w:t xml:space="preserve">3, The thrid paragraph is not understandable since it is not logical and is difficult for readers to find out which is </w:t>
+        <w:t>3, The th</w:t>
+      </w:r>
+      <w:r>
+        <w:rPr>
+          <w:rFonts w:ascii="Times New Roman" w:hAnsi="Times New Roman" w:cs="Times New Roman" w:hint="eastAsia"/>
+        </w:rPr>
+        <w:t>ir</w:t>
+      </w:r>
+      <w:r>
+        <w:rPr>
+          <w:rFonts w:ascii="Times New Roman" w:hAnsi="Times New Roman" w:cs="Times New Roman" w:hint="eastAsia"/>
+        </w:rPr>
+        <w:t>d paragraph is not understandable since it is not</w:t>
+      </w:r>
+      <w:r>
+        <w:rPr>
+          <w:rFonts w:ascii="Times New Roman" w:hAnsi="Times New Roman" w:cs="Times New Roman" w:hint="eastAsia"/>
+        </w:rPr>
+        <w:t xml:space="preserve"> so logical that it</w:t>
+      </w:r>
+      <w:r>
+        <w:rPr>
+          <w:rFonts w:ascii="Times New Roman" w:hAnsi="Times New Roman" w:cs="Times New Roman" w:hint="eastAsia"/>
+        </w:rPr>
+        <w:t xml:space="preserve"> is difficult for readers to find out which is </w:t>
       </w:r>
       <w:r>
         <w:rPr>
@@ -4493,6 +4530,18 @@
       </w:r>
       <w:r>
         <w:rPr>
+          <w:rFonts w:ascii="Times New Roman" w:hAnsi="Times New Roman" w:cs="Times New Roman" w:hint="eastAsia"/>
+        </w:rPr>
+        <w:t xml:space="preserve">which </w:t>
+      </w:r>
+      <w:r>
+        <w:rPr>
+          <w:rFonts w:ascii="Times New Roman" w:hAnsi="Times New Roman" w:cs="Times New Roman" w:hint="eastAsia"/>
+        </w:rPr>
+        <w:t xml:space="preserve">is </w:t>
+      </w:r>
+      <w:r>
+        <w:rPr>
           <w:rFonts w:ascii="Times New Roman" w:hAnsi="Times New Roman" w:cs="Times New Roman"/>
         </w:rPr>
         <w:t>“</w:t>
@@ -4568,13 +4617,25 @@
         <w:rPr>
           <w:rFonts w:ascii="Times New Roman" w:hAnsi="Times New Roman" w:cs="Times New Roman" w:hint="eastAsia"/>
         </w:rPr>
+        <w:t xml:space="preserve">that </w:t>
+      </w:r>
+      <w:r>
+        <w:rPr>
+          <w:rFonts w:ascii="Times New Roman" w:hAnsi="Times New Roman" w:cs="Times New Roman" w:hint="eastAsia"/>
+        </w:rPr>
         <w:t xml:space="preserve">France </w:t>
       </w:r>
       <w:r>
         <w:rPr>
           <w:rFonts w:ascii="Times New Roman" w:hAnsi="Times New Roman" w:cs="Times New Roman" w:hint="eastAsia"/>
         </w:rPr>
-        <w:t>spending the le</w:t>
+        <w:t>spent</w:t>
+      </w:r>
+      <w:r>
+        <w:rPr>
+          <w:rFonts w:ascii="Times New Roman" w:hAnsi="Times New Roman" w:cs="Times New Roman" w:hint="eastAsia"/>
+        </w:rPr>
+        <w:t xml:space="preserve"> the le</w:t>
       </w:r>
       <w:r>
         <w:rPr>
@@ -4599,7 +4660,19 @@
         <w:rPr>
           <w:rFonts w:ascii="Times New Roman" w:hAnsi="Times New Roman" w:cs="Times New Roman" w:hint="eastAsia"/>
         </w:rPr>
-        <w:t xml:space="preserve">4, For body paragraphs, there are two altenative ways to organise them logically. </w:t>
+        <w:t>4, For body paragraphs, there are two altenative</w:t>
+      </w:r>
+      <w:r>
+        <w:rPr>
+          <w:rFonts w:ascii="Times New Roman" w:hAnsi="Times New Roman" w:cs="Times New Roman" w:hint="eastAsia"/>
+        </w:rPr>
+        <w:t>s</w:t>
+      </w:r>
+      <w:r>
+        <w:rPr>
+          <w:rFonts w:ascii="Times New Roman" w:hAnsi="Times New Roman" w:cs="Times New Roman" w:hint="eastAsia"/>
+        </w:rPr>
+        <w:t xml:space="preserve"> to organise them logically. </w:t>
       </w:r>
       <w:r>
         <w:rPr>
@@ -4787,7 +4860,19 @@
         <w:rPr>
           <w:rFonts w:ascii="Times New Roman" w:hAnsi="Times New Roman" w:cs="Times New Roman" w:hint="eastAsia"/>
         </w:rPr>
-        <w:t xml:space="preserve">expenditure in Britain was higher than in France. </w:t>
+        <w:t>expenditure in Britain was higher than</w:t>
+      </w:r>
+      <w:r>
+        <w:rPr>
+          <w:rFonts w:ascii="Times New Roman" w:hAnsi="Times New Roman" w:cs="Times New Roman" w:hint="eastAsia"/>
+        </w:rPr>
+        <w:t xml:space="preserve"> that</w:t>
+      </w:r>
+      <w:r>
+        <w:rPr>
+          <w:rFonts w:ascii="Times New Roman" w:hAnsi="Times New Roman" w:cs="Times New Roman" w:hint="eastAsia"/>
+        </w:rPr>
+        <w:t xml:space="preserve"> in France. </w:t>
       </w:r>
       <w:r>
         <w:rPr>
@@ -4854,13 +4939,56 @@
         <w:rPr>
           <w:rFonts w:ascii="Times New Roman" w:hAnsi="Times New Roman" w:cs="Times New Roman" w:hint="eastAsia"/>
         </w:rPr>
-        <w:t xml:space="preserve">400,00. </w:t>
-      </w:r>
-      <w:r>
-        <w:rPr>
-          <w:rFonts w:ascii="Times New Roman" w:hAnsi="Times New Roman" w:cs="Times New Roman" w:hint="eastAsia"/>
-        </w:rPr>
-        <w:t xml:space="preserve">Similiarly, the expenditure of books in UK was much higher than in France, which were slightly over </w:t>
+        <w:t>400,00</w:t>
+      </w:r>
+      <w:r>
+        <w:rPr>
+          <w:rFonts w:ascii="Times New Roman" w:hAnsi="Times New Roman" w:cs="Times New Roman" w:hint="eastAsia"/>
+        </w:rPr>
+        <w:t>0</w:t>
+      </w:r>
+      <w:r>
+        <w:rPr>
+          <w:rFonts w:ascii="Times New Roman" w:hAnsi="Times New Roman" w:cs="Times New Roman" w:hint="eastAsia"/>
+        </w:rPr>
+        <w:t xml:space="preserve">. </w:t>
+      </w:r>
+      <w:r>
+        <w:rPr>
+          <w:rFonts w:ascii="Times New Roman" w:hAnsi="Times New Roman" w:cs="Times New Roman" w:hint="eastAsia"/>
+        </w:rPr>
+        <w:t xml:space="preserve">Similiarly, the expenditure of books in UK was </w:t>
+      </w:r>
+      <w:r>
+        <w:rPr>
+          <w:rFonts w:ascii="Times New Roman" w:hAnsi="Times New Roman" w:cs="Times New Roman" w:hint="eastAsia"/>
+          <w:strike/>
+        </w:rPr>
+        <w:t>much</w:t>
+      </w:r>
+      <w:r>
+        <w:rPr>
+          <w:rFonts w:ascii="Times New Roman" w:hAnsi="Times New Roman" w:cs="Times New Roman" w:hint="eastAsia"/>
+        </w:rPr>
+        <w:t>(quite)</w:t>
+      </w:r>
+      <w:r>
+        <w:rPr>
+          <w:rFonts w:ascii="Times New Roman" w:hAnsi="Times New Roman" w:cs="Times New Roman" w:hint="eastAsia"/>
+        </w:rPr>
+        <w:t xml:space="preserve"> higher than</w:t>
+      </w:r>
+      <w:r>
+        <w:rPr>
+          <w:rFonts w:ascii="Times New Roman" w:hAnsi="Times New Roman" w:cs="Times New Roman" w:hint="eastAsia"/>
+        </w:rPr>
+        <w:t xml:space="preserve"> that </w:t>
+      </w:r>
+      <w:r>
+        <w:rPr>
+          <w:rFonts w:ascii="Times New Roman" w:hAnsi="Times New Roman" w:cs="Times New Roman" w:hint="eastAsia"/>
+        </w:rPr>
+        <w:t xml:space="preserve"> in France, which were slightly over </w:t>
       </w:r>
       <w:r>
         <w:rPr>
@@ -4872,7 +5000,19 @@
         <w:rPr>
           <w:rFonts w:ascii="Times New Roman" w:hAnsi="Times New Roman" w:cs="Times New Roman" w:hint="eastAsia"/>
         </w:rPr>
-        <w:t xml:space="preserve">400,00 and nearly </w:t>
+        <w:t>400,00</w:t>
+      </w:r>
+      <w:r>
+        <w:rPr>
+          <w:rFonts w:ascii="Times New Roman" w:hAnsi="Times New Roman" w:cs="Times New Roman" w:hint="eastAsia"/>
+        </w:rPr>
+        <w:t>0</w:t>
+      </w:r>
+      <w:r>
+        <w:rPr>
+          <w:rFonts w:ascii="Times New Roman" w:hAnsi="Times New Roman" w:cs="Times New Roman" w:hint="eastAsia"/>
+        </w:rPr>
+        <w:t xml:space="preserve"> and nearly </w:t>
       </w:r>
       <w:r>
         <w:rPr>
@@ -4956,7 +5096,7 @@
     <w:p>
       <w:pPr>
         <w:rPr>
-          <w:rFonts w:ascii="Times New Roman" w:hAnsi="Times New Roman" w:cs="Times New Roman" w:hint="eastAsia"/>
+          <w:rFonts w:ascii="Times New Roman" w:hAnsi="Times New Roman" w:cs="Times New Roman"/>
           <w:lang w:val="en-US"/>
         </w:rPr>
       </w:pPr>
@@ -4990,13 +5130,34 @@
           <w:rFonts w:ascii="Times New Roman" w:hAnsi="Times New Roman" w:cs="Times New Roman" w:hint="eastAsia"/>
           <w:lang w:val="en-US"/>
         </w:rPr>
-        <w:t>350,00, which was more than it (</w:t>
-      </w:r>
-      <w:r>
-        <w:rPr>
-          <w:rFonts w:ascii="Times New Roman" w:hAnsi="Times New Roman" w:cs="Times New Roman"/>
+        <w:t>350,00</w:t>
+      </w:r>
+      <w:r>
+        <w:rPr>
+          <w:rFonts w:ascii="Times New Roman" w:hAnsi="Times New Roman" w:cs="Times New Roman" w:hint="eastAsia"/>
           <w:lang w:val="en-US"/>
         </w:rPr>
+        <w:t>0</w:t>
+      </w:r>
+      <w:r>
+        <w:rPr>
+          <w:rFonts w:ascii="Times New Roman" w:hAnsi="Times New Roman" w:cs="Times New Roman" w:hint="eastAsia"/>
+          <w:lang w:val="en-US"/>
+        </w:rPr>
+        <w:t>, which was more than that</w:t>
+      </w:r>
+      <w:r>
+        <w:rPr>
+          <w:rFonts w:ascii="Times New Roman" w:hAnsi="Times New Roman" w:cs="Times New Roman" w:hint="eastAsia"/>
+          <w:lang w:val="en-US"/>
+        </w:rPr>
+        <w:t xml:space="preserve"> (</w:t>
+      </w:r>
+      <w:r>
+        <w:rPr>
+          <w:rFonts w:ascii="Times New Roman" w:hAnsi="Times New Roman" w:cs="Times New Roman"/>
+          <w:lang w:val="en-US"/>
+        </w:rPr>
         <w:t>£</w:t>
       </w:r>
       <w:r>
@@ -5004,7 +5165,21 @@
           <w:rFonts w:ascii="Times New Roman" w:hAnsi="Times New Roman" w:cs="Times New Roman" w:hint="eastAsia"/>
           <w:lang w:val="en-US"/>
         </w:rPr>
-        <w:t xml:space="preserve">300,00) spent by </w:t>
+        <w:t>300,00</w:t>
+      </w:r>
+      <w:r>
+        <w:rPr>
+          <w:rFonts w:ascii="Times New Roman" w:hAnsi="Times New Roman" w:cs="Times New Roman" w:hint="eastAsia"/>
+          <w:lang w:val="en-US"/>
+        </w:rPr>
+        <w:t>0</w:t>
+      </w:r>
+      <w:r>
+        <w:rPr>
+          <w:rFonts w:ascii="Times New Roman" w:hAnsi="Times New Roman" w:cs="Times New Roman" w:hint="eastAsia"/>
+          <w:lang w:val="en-US"/>
+        </w:rPr>
+        <w:t xml:space="preserve">) spent by </w:t>
       </w:r>
       <w:r>
         <w:rPr>
@@ -5106,7 +5281,7 @@
     <w:p>
       <w:pPr>
         <w:rPr>
-          <w:rFonts w:ascii="Times New Roman" w:hAnsi="Times New Roman" w:cs="Times New Roman" w:hint="eastAsia"/>
+          <w:rFonts w:ascii="Times New Roman" w:hAnsi="Times New Roman" w:cs="Times New Roman"/>
         </w:rPr>
       </w:pPr>
       <w:r>
@@ -5155,14 +5330,14 @@
     <w:p>
       <w:pPr>
         <w:rPr>
-          <w:rFonts w:ascii="Times New Roman" w:hAnsi="Times New Roman" w:cs="Times New Roman" w:hint="eastAsia"/>
-        </w:rPr>
-      </w:pPr>
-    </w:p>
-    <w:p>
-      <w:pPr>
-        <w:rPr>
-          <w:rFonts w:ascii="Times New Roman" w:hAnsi="Times New Roman" w:cs="Times New Roman" w:hint="eastAsia"/>
+          <w:rFonts w:ascii="Times New Roman" w:hAnsi="Times New Roman" w:cs="Times New Roman"/>
+        </w:rPr>
+      </w:pPr>
+    </w:p>
+    <w:p>
+      <w:pPr>
+        <w:rPr>
+          <w:rFonts w:ascii="Times New Roman" w:hAnsi="Times New Roman" w:cs="Times New Roman"/>
           <w:b/>
           <w:bCs/>
           <w:i/>
@@ -5221,20 +5396,143 @@
         <w:rPr>
           <w:rFonts w:ascii="Times New Roman" w:hAnsi="Times New Roman" w:cs="Times New Roman"/>
         </w:rPr>
-        <w:t>The bar chart illustrates the money that British and French spent on cars, computers, books, perfume and cameras in 2010. Units are measured in pound sterling.</w:t>
-      </w:r>
-    </w:p>
-    <w:p>
-      <w:pPr>
-        <w:rPr>
-          <w:rFonts w:ascii="Times New Roman" w:hAnsi="Times New Roman" w:cs="Times New Roman"/>
-        </w:rPr>
-      </w:pPr>
-      <w:r>
-        <w:rPr>
-          <w:rFonts w:ascii="Times New Roman" w:hAnsi="Times New Roman" w:cs="Times New Roman"/>
-        </w:rPr>
-        <w:t xml:space="preserve">Generaly, Britain consumed more than France in total. Both countries spent the most money on cars. Whereas, the least amout of money was spent on perfume in UK  while on camera in France. In addition, the most significant difference between two countries was in the consumption of cameras. </w:t>
+        <w:t xml:space="preserve">The bar chart illustrates the money </w:t>
+      </w:r>
+      <w:r>
+        <w:rPr>
+          <w:rFonts w:ascii="Times New Roman" w:hAnsi="Times New Roman" w:cs="Times New Roman"/>
+          <w:highlight w:val="yellow"/>
+        </w:rPr>
+        <w:t>that British and French</w:t>
+      </w:r>
+      <w:r>
+        <w:rPr>
+          <w:rFonts w:ascii="Times New Roman" w:hAnsi="Times New Roman" w:cs="Times New Roman"/>
+        </w:rPr>
+        <w:t xml:space="preserve"> spent on cars, computers, books, perfume and cameras in 2010. Units are measured in </w:t>
+      </w:r>
+      <w:r>
+        <w:rPr>
+          <w:rFonts w:ascii="Times New Roman" w:hAnsi="Times New Roman" w:cs="Times New Roman"/>
+          <w:highlight w:val="yellow"/>
+        </w:rPr>
+        <w:t>pound sterling</w:t>
+      </w:r>
+      <w:r>
+        <w:rPr>
+          <w:rFonts w:ascii="Times New Roman" w:hAnsi="Times New Roman" w:cs="Times New Roman"/>
+        </w:rPr>
+        <w:t>.</w:t>
+      </w:r>
+    </w:p>
+    <w:p>
+      <w:pPr>
+        <w:rPr>
+          <w:rFonts w:ascii="Times New Roman" w:hAnsi="Times New Roman" w:cs="Times New Roman"/>
+        </w:rPr>
+      </w:pPr>
+      <w:r>
+        <w:rPr>
+          <w:rFonts w:ascii="Times New Roman" w:hAnsi="Times New Roman" w:cs="Times New Roman"/>
+          <w:highlight w:val="red"/>
+        </w:rPr>
+        <w:t>Generaly</w:t>
+      </w:r>
+      <w:r>
+        <w:rPr>
+          <w:rFonts w:ascii="Times New Roman" w:hAnsi="Times New Roman" w:cs="Times New Roman" w:hint="eastAsia"/>
+        </w:rPr>
+        <w:t>[</w:t>
+      </w:r>
+      <w:r>
+        <w:rPr>
+          <w:rFonts w:ascii="Times New Roman" w:hAnsi="Times New Roman" w:cs="Times New Roman" w:hint="eastAsia"/>
+          <w:highlight w:val="green"/>
+        </w:rPr>
+        <w:t>Generally</w:t>
+      </w:r>
+      <w:r>
+        <w:rPr>
+          <w:rFonts w:ascii="Times New Roman" w:hAnsi="Times New Roman" w:cs="Times New Roman" w:hint="eastAsia"/>
+        </w:rPr>
+        <w:t>]</w:t>
+      </w:r>
+      <w:r>
+        <w:rPr>
+          <w:rFonts w:ascii="Times New Roman" w:hAnsi="Times New Roman" w:cs="Times New Roman"/>
+        </w:rPr>
+        <w:t xml:space="preserve">, Britain consumed more than France in total. Both countries spent the most money on cars. Whereas, the least </w:t>
+      </w:r>
+      <w:r>
+        <w:rPr>
+          <w:rFonts w:ascii="Times New Roman" w:hAnsi="Times New Roman" w:cs="Times New Roman"/>
+          <w:highlight w:val="red"/>
+        </w:rPr>
+        <w:t>amout</w:t>
+      </w:r>
+      <w:r>
+        <w:rPr>
+          <w:rFonts w:ascii="Times New Roman" w:hAnsi="Times New Roman" w:cs="Times New Roman" w:hint="eastAsia"/>
+        </w:rPr>
+        <w:t>[</w:t>
+      </w:r>
+      <w:r>
+        <w:rPr>
+          <w:rFonts w:ascii="Times New Roman" w:hAnsi="Times New Roman" w:cs="Times New Roman" w:hint="eastAsia"/>
+          <w:highlight w:val="green"/>
+        </w:rPr>
+        <w:t>amount</w:t>
+      </w:r>
+      <w:r>
+        <w:rPr>
+          <w:rFonts w:ascii="Times New Roman" w:hAnsi="Times New Roman" w:cs="Times New Roman" w:hint="eastAsia"/>
+        </w:rPr>
+        <w:t>]</w:t>
+      </w:r>
+      <w:r>
+        <w:rPr>
+          <w:rFonts w:ascii="Times New Roman" w:hAnsi="Times New Roman" w:cs="Times New Roman"/>
+        </w:rPr>
+        <w:t xml:space="preserve"> of money was spent </w:t>
+      </w:r>
+      <w:r>
+        <w:rPr>
+          <w:rFonts w:ascii="Times New Roman" w:hAnsi="Times New Roman" w:cs="Times New Roman"/>
+          <w:highlight w:val="yellow"/>
+        </w:rPr>
+        <w:t>on perfume in UK</w:t>
+      </w:r>
+      <w:r>
+        <w:rPr>
+          <w:rFonts w:ascii="Times New Roman" w:hAnsi="Times New Roman" w:cs="Times New Roman"/>
+        </w:rPr>
+        <w:t xml:space="preserve">  while on camera in France. In addition, the most significant difference </w:t>
+      </w:r>
+      <w:r>
+        <w:rPr>
+          <w:rFonts w:ascii="Times New Roman" w:hAnsi="Times New Roman" w:cs="Times New Roman"/>
+          <w:highlight w:val="yellow"/>
+        </w:rPr>
+        <w:t>between two countries</w:t>
+      </w:r>
+      <w:r>
+        <w:rPr>
+          <w:rFonts w:ascii="Times New Roman" w:hAnsi="Times New Roman" w:cs="Times New Roman"/>
+        </w:rPr>
+        <w:t xml:space="preserve"> was </w:t>
+      </w:r>
+      <w:r>
+        <w:rPr>
+          <w:rFonts w:ascii="Times New Roman" w:hAnsi="Times New Roman" w:cs="Times New Roman"/>
+          <w:highlight w:val="yellow"/>
+        </w:rPr>
+        <w:t>in</w:t>
+      </w:r>
+      <w:r>
+        <w:rPr>
+          <w:rFonts w:ascii="Times New Roman" w:hAnsi="Times New Roman" w:cs="Times New Roman"/>
+        </w:rPr>
+        <w:t xml:space="preserve"> the consumption of cameras. </w:t>
       </w:r>
     </w:p>
     <w:p>
@@ -5248,30 +5546,769 @@
           <w:rFonts w:ascii="Times New Roman" w:hAnsi="Times New Roman" w:cs="Times New Roman"/>
         </w:rPr>
         <w:lastRenderedPageBreak/>
-        <w:t>In terms of cars, the amount of money spent by British was just over £450,000 and of French was exactly £400,000. Britain spent less than £150,000 on perfume compared £200,000 in France. Whereas ,there was a sharp contrast in the expenditure of cameras; consumers in UK spent a little bit more than £350,000 which was as more than two times as the amount (£150,000) in France.</w:t>
-      </w:r>
-    </w:p>
-    <w:p>
-      <w:pPr>
-        <w:rPr>
-          <w:rFonts w:ascii="Times New Roman" w:hAnsi="Times New Roman" w:cs="Times New Roman"/>
-        </w:rPr>
-      </w:pPr>
-      <w:r>
-        <w:rPr>
-          <w:rFonts w:ascii="Times New Roman" w:hAnsi="Times New Roman" w:cs="Times New Roman"/>
-        </w:rPr>
-        <w:t>For computers, it cost British cosumers about £375,000 and French ones £300,000. People in UK spent around £400,000 on books while those in France spent £300,000.</w:t>
-      </w:r>
-    </w:p>
-    <w:p>
-      <w:pPr>
-        <w:rPr>
-          <w:rFonts w:ascii="Times New Roman" w:hAnsi="Times New Roman" w:cs="Times New Roman"/>
+        <w:t xml:space="preserve">In terms of cars, the amount of money spent by British was just over £450,000 and </w:t>
+      </w:r>
+      <w:r>
+        <w:rPr>
+          <w:rFonts w:ascii="Times New Roman" w:hAnsi="Times New Roman" w:cs="Times New Roman" w:hint="eastAsia"/>
+        </w:rPr>
+        <w:t xml:space="preserve">that </w:t>
+      </w:r>
+      <w:r>
+        <w:rPr>
+          <w:rFonts w:ascii="Times New Roman" w:hAnsi="Times New Roman" w:cs="Times New Roman"/>
+        </w:rPr>
+        <w:t xml:space="preserve">of French was exactly £400,000. Britain spent less than £150,000 on perfume </w:t>
+      </w:r>
+      <w:r>
+        <w:rPr>
+          <w:rFonts w:ascii="Times New Roman" w:hAnsi="Times New Roman" w:cs="Times New Roman"/>
+          <w:highlight w:val="yellow"/>
+        </w:rPr>
+        <w:t>compared £200,000</w:t>
+      </w:r>
+      <w:r>
+        <w:rPr>
+          <w:rFonts w:ascii="Times New Roman" w:hAnsi="Times New Roman" w:cs="Times New Roman"/>
+        </w:rPr>
+        <w:t xml:space="preserve"> in France. Whereas</w:t>
+      </w:r>
+      <w:r>
+        <w:rPr>
+          <w:rFonts w:ascii="Times New Roman" w:hAnsi="Times New Roman" w:cs="Times New Roman"/>
+        </w:rPr>
+        <w:t>,</w:t>
+      </w:r>
+      <w:r>
+        <w:rPr>
+          <w:rFonts w:ascii="Times New Roman" w:hAnsi="Times New Roman" w:cs="Times New Roman" w:hint="eastAsia"/>
+        </w:rPr>
+        <w:t xml:space="preserve"> </w:t>
+      </w:r>
+      <w:r>
+        <w:rPr>
+          <w:rFonts w:ascii="Times New Roman" w:hAnsi="Times New Roman" w:cs="Times New Roman"/>
+        </w:rPr>
+        <w:t xml:space="preserve">there was a sharp contrast in the expenditure of cameras; consumers in UK spent </w:t>
+      </w:r>
+      <w:r>
+        <w:rPr>
+          <w:rFonts w:ascii="Times New Roman" w:hAnsi="Times New Roman" w:cs="Times New Roman"/>
+          <w:strike/>
+          <w:highlight w:val="darkGray"/>
+        </w:rPr>
+        <w:t>a little bit</w:t>
+      </w:r>
+      <w:r>
+        <w:rPr>
+          <w:rFonts w:ascii="Times New Roman" w:hAnsi="Times New Roman" w:cs="Times New Roman" w:hint="eastAsia"/>
+          <w:highlight w:val="green"/>
+        </w:rPr>
+        <w:t>[</w:t>
+      </w:r>
+      <w:r>
+        <w:rPr>
+          <w:rFonts w:ascii="Times New Roman" w:hAnsi="Times New Roman" w:cs="Times New Roman" w:hint="eastAsia"/>
+          <w:highlight w:val="green"/>
+        </w:rPr>
+        <w:t>just</w:t>
+      </w:r>
+      <w:r>
+        <w:rPr>
+          <w:rFonts w:ascii="Times New Roman" w:hAnsi="Times New Roman" w:cs="Times New Roman" w:hint="eastAsia"/>
+        </w:rPr>
+        <w:t>]</w:t>
+      </w:r>
+      <w:r>
+        <w:rPr>
+          <w:rFonts w:ascii="Times New Roman" w:hAnsi="Times New Roman" w:cs="Times New Roman"/>
+        </w:rPr>
+        <w:t xml:space="preserve"> more than £350,000 which was as more than two times as the amount (£150,000) in France.</w:t>
+      </w:r>
+    </w:p>
+    <w:p>
+      <w:pPr>
+        <w:rPr>
+          <w:rFonts w:ascii="Times New Roman" w:hAnsi="Times New Roman" w:cs="Times New Roman" w:hint="eastAsia"/>
+        </w:rPr>
+      </w:pPr>
+      <w:r>
+        <w:rPr>
+          <w:rFonts w:ascii="Times New Roman" w:hAnsi="Times New Roman" w:cs="Times New Roman"/>
+        </w:rPr>
+        <w:t>For computers, it cost</w:t>
+      </w:r>
+      <w:r>
+        <w:rPr>
+          <w:rFonts w:ascii="Times New Roman" w:hAnsi="Times New Roman" w:cs="Times New Roman" w:hint="eastAsia"/>
+        </w:rPr>
+        <w:t>(</w:t>
+      </w:r>
+      <w:r>
+        <w:rPr>
+          <w:rFonts w:ascii="Times New Roman" w:hAnsi="Times New Roman" w:cs="Times New Roman" w:hint="eastAsia"/>
+          <w:highlight w:val="green"/>
+        </w:rPr>
+        <w:t>s</w:t>
+      </w:r>
+      <w:r>
+        <w:rPr>
+          <w:rFonts w:ascii="Times New Roman" w:hAnsi="Times New Roman" w:cs="Times New Roman" w:hint="eastAsia"/>
+        </w:rPr>
+        <w:t>)</w:t>
+      </w:r>
+      <w:r>
+        <w:rPr>
+          <w:rFonts w:ascii="Times New Roman" w:hAnsi="Times New Roman" w:cs="Times New Roman"/>
+        </w:rPr>
+        <w:t xml:space="preserve"> British </w:t>
+      </w:r>
+      <w:r>
+        <w:rPr>
+          <w:rFonts w:ascii="Times New Roman" w:hAnsi="Times New Roman" w:cs="Times New Roman"/>
+          <w:highlight w:val="red"/>
+        </w:rPr>
+        <w:t>cosumers</w:t>
+      </w:r>
+      <w:r>
+        <w:rPr>
+          <w:rFonts w:ascii="Times New Roman" w:hAnsi="Times New Roman" w:cs="Times New Roman" w:hint="eastAsia"/>
+        </w:rPr>
+        <w:t>[</w:t>
+      </w:r>
+      <w:r>
+        <w:rPr>
+          <w:rFonts w:ascii="Times New Roman" w:hAnsi="Times New Roman" w:cs="Times New Roman" w:hint="eastAsia"/>
+          <w:highlight w:val="green"/>
+        </w:rPr>
+        <w:t>consumers</w:t>
+      </w:r>
+      <w:r>
+        <w:rPr>
+          <w:rFonts w:ascii="Times New Roman" w:hAnsi="Times New Roman" w:cs="Times New Roman" w:hint="eastAsia"/>
+        </w:rPr>
+        <w:t>]</w:t>
+      </w:r>
+      <w:r>
+        <w:rPr>
+          <w:rFonts w:ascii="Times New Roman" w:hAnsi="Times New Roman" w:cs="Times New Roman"/>
+        </w:rPr>
+        <w:t xml:space="preserve"> </w:t>
+      </w:r>
+      <w:r>
+        <w:rPr>
+          <w:rFonts w:ascii="Times New Roman" w:hAnsi="Times New Roman" w:cs="Times New Roman"/>
+        </w:rPr>
+        <w:t xml:space="preserve">about £375,000 and French £300,000. </w:t>
+      </w:r>
+      <w:r>
+        <w:rPr>
+          <w:rFonts w:ascii="Times New Roman" w:hAnsi="Times New Roman" w:cs="Times New Roman"/>
+          <w:highlight w:val="yellow"/>
+        </w:rPr>
+        <w:t xml:space="preserve">People in </w:t>
+      </w:r>
+      <w:r>
+        <w:rPr>
+          <w:rFonts w:ascii="Times New Roman" w:hAnsi="Times New Roman" w:cs="Times New Roman" w:hint="eastAsia"/>
+          <w:highlight w:val="yellow"/>
+        </w:rPr>
+        <w:t>[</w:t>
+      </w:r>
+      <w:r>
+        <w:rPr>
+          <w:rFonts w:ascii="Times New Roman" w:hAnsi="Times New Roman" w:cs="Times New Roman" w:hint="eastAsia"/>
+          <w:highlight w:val="green"/>
+        </w:rPr>
+        <w:t>the</w:t>
+      </w:r>
+      <w:r>
+        <w:rPr>
+          <w:rFonts w:ascii="Times New Roman" w:hAnsi="Times New Roman" w:cs="Times New Roman" w:hint="eastAsia"/>
+          <w:highlight w:val="yellow"/>
+        </w:rPr>
+        <w:t>]</w:t>
+      </w:r>
+      <w:r>
+        <w:rPr>
+          <w:rFonts w:ascii="Times New Roman" w:hAnsi="Times New Roman" w:cs="Times New Roman"/>
+          <w:highlight w:val="yellow"/>
+        </w:rPr>
+        <w:t>UK spent around £400,000 on books while those in France spent £300,000.</w:t>
+      </w:r>
+    </w:p>
+    <w:p>
+      <w:pPr>
+        <w:rPr>
+          <w:rFonts w:ascii="Times New Roman" w:hAnsi="Times New Roman" w:cs="Times New Roman" w:hint="eastAsia"/>
+          <w:b/>
+          <w:i/>
+        </w:rPr>
+      </w:pPr>
+      <w:r>
+        <w:rPr>
+          <w:rFonts w:ascii="Times New Roman" w:hAnsi="Times New Roman" w:cs="Times New Roman" w:hint="eastAsia"/>
+          <w:b/>
+          <w:i/>
+        </w:rPr>
+        <w:t>Errors and mistakes in my repo</w:t>
+      </w:r>
+      <w:r>
+        <w:rPr>
+          <w:rFonts w:ascii="Times New Roman" w:hAnsi="Times New Roman" w:cs="Times New Roman" w:hint="eastAsia"/>
+          <w:b/>
+          <w:i/>
+        </w:rPr>
+        <w:t>st 2</w:t>
+      </w:r>
+    </w:p>
+    <w:p>
+      <w:pPr>
+        <w:pStyle w:val="a6"/>
+        <w:numPr>
+          <w:ilvl w:val="0"/>
+          <w:numId w:val="6"/>
+        </w:numPr>
+        <w:rPr>
+          <w:rFonts w:ascii="Times New Roman" w:hAnsi="Times New Roman" w:cs="Times New Roman" w:hint="eastAsia"/>
+        </w:rPr>
+      </w:pPr>
+      <w:r>
+        <w:rPr>
+          <w:rFonts w:ascii="Times New Roman" w:hAnsi="Times New Roman" w:cs="Times New Roman"/>
+        </w:rPr>
+        <w:t>“</w:t>
+      </w:r>
+      <w:r>
+        <w:rPr>
+          <w:rFonts w:ascii="Times New Roman" w:hAnsi="Times New Roman" w:cs="Times New Roman" w:hint="eastAsia"/>
+        </w:rPr>
+        <w:t>that British and French...</w:t>
+      </w:r>
+      <w:r>
+        <w:rPr>
+          <w:rFonts w:ascii="Times New Roman" w:hAnsi="Times New Roman" w:cs="Times New Roman"/>
+        </w:rPr>
+        <w:t>”</w:t>
+      </w:r>
+      <w:r>
+        <w:rPr>
+          <w:rFonts w:ascii="Times New Roman" w:hAnsi="Times New Roman" w:cs="Times New Roman" w:hint="eastAsia"/>
+        </w:rPr>
+        <w:t xml:space="preserve"> -&gt; that </w:t>
+      </w:r>
+      <w:r>
+        <w:rPr>
+          <w:rFonts w:ascii="Times New Roman" w:hAnsi="Times New Roman" w:cs="Times New Roman" w:hint="eastAsia"/>
+          <w:highlight w:val="green"/>
+        </w:rPr>
+        <w:t>the</w:t>
+      </w:r>
+      <w:r>
+        <w:rPr>
+          <w:rFonts w:ascii="Times New Roman" w:hAnsi="Times New Roman" w:cs="Times New Roman" w:hint="eastAsia"/>
+        </w:rPr>
+        <w:t xml:space="preserve"> British...</w:t>
+      </w:r>
+    </w:p>
+    <w:p>
+      <w:pPr>
+        <w:pStyle w:val="a6"/>
+        <w:numPr>
+          <w:ilvl w:val="0"/>
+          <w:numId w:val="6"/>
+        </w:numPr>
+        <w:rPr>
+          <w:rFonts w:ascii="Times New Roman" w:hAnsi="Times New Roman" w:cs="Times New Roman" w:hint="eastAsia"/>
+        </w:rPr>
+      </w:pPr>
+      <w:r>
+        <w:rPr>
+          <w:rFonts w:ascii="Times New Roman" w:hAnsi="Times New Roman" w:cs="Times New Roman" w:hint="eastAsia"/>
+        </w:rPr>
+        <w:t xml:space="preserve">pounds sterling: </w:t>
+      </w:r>
+      <w:r>
+        <w:rPr>
+          <w:rFonts w:ascii="Times New Roman" w:hAnsi="Times New Roman" w:cs="Times New Roman"/>
+        </w:rPr>
+        <w:t>“</w:t>
+      </w:r>
+      <w:r>
+        <w:rPr>
+          <w:rFonts w:ascii="Times New Roman" w:hAnsi="Times New Roman" w:cs="Times New Roman" w:hint="eastAsia"/>
+        </w:rPr>
+        <w:t>pounds</w:t>
+      </w:r>
+      <w:r>
+        <w:rPr>
+          <w:rFonts w:ascii="Times New Roman" w:hAnsi="Times New Roman" w:cs="Times New Roman"/>
+        </w:rPr>
+        <w:t>”</w:t>
+      </w:r>
+      <w:r>
+        <w:rPr>
+          <w:rFonts w:ascii="Times New Roman" w:hAnsi="Times New Roman" w:cs="Times New Roman" w:hint="eastAsia"/>
+        </w:rPr>
+        <w:t xml:space="preserve"> is plural.</w:t>
+      </w:r>
+    </w:p>
+    <w:p>
+      <w:pPr>
+        <w:pStyle w:val="a6"/>
+        <w:numPr>
+          <w:ilvl w:val="0"/>
+          <w:numId w:val="6"/>
+        </w:numPr>
+        <w:rPr>
+          <w:rFonts w:ascii="Times New Roman" w:hAnsi="Times New Roman" w:cs="Times New Roman" w:hint="eastAsia"/>
+        </w:rPr>
+      </w:pPr>
+      <w:r>
+        <w:rPr>
+          <w:rFonts w:ascii="Times New Roman" w:hAnsi="Times New Roman" w:cs="Times New Roman"/>
+        </w:rPr>
+        <w:t>“</w:t>
+      </w:r>
+      <w:r>
+        <w:rPr>
+          <w:rFonts w:ascii="Times New Roman" w:hAnsi="Times New Roman" w:cs="Times New Roman" w:hint="eastAsia"/>
+        </w:rPr>
+        <w:t>perfume in UK</w:t>
+      </w:r>
+      <w:r>
+        <w:rPr>
+          <w:rFonts w:ascii="Times New Roman" w:hAnsi="Times New Roman" w:cs="Times New Roman"/>
+        </w:rPr>
+        <w:t>”</w:t>
+      </w:r>
+      <w:r>
+        <w:rPr>
+          <w:rFonts w:ascii="Times New Roman" w:hAnsi="Times New Roman" w:cs="Times New Roman" w:hint="eastAsia"/>
+        </w:rPr>
+        <w:t xml:space="preserve">: perfume in </w:t>
+      </w:r>
+      <w:r>
+        <w:rPr>
+          <w:rFonts w:ascii="Times New Roman" w:hAnsi="Times New Roman" w:cs="Times New Roman" w:hint="eastAsia"/>
+          <w:highlight w:val="green"/>
+        </w:rPr>
+        <w:t>the</w:t>
+      </w:r>
+      <w:r>
+        <w:rPr>
+          <w:rFonts w:ascii="Times New Roman" w:hAnsi="Times New Roman" w:cs="Times New Roman" w:hint="eastAsia"/>
+        </w:rPr>
+        <w:t xml:space="preserve"> UK</w:t>
+      </w:r>
+    </w:p>
+    <w:p>
+      <w:pPr>
+        <w:pStyle w:val="a6"/>
+        <w:numPr>
+          <w:ilvl w:val="0"/>
+          <w:numId w:val="6"/>
+        </w:numPr>
+        <w:rPr>
+          <w:rFonts w:ascii="Times New Roman" w:hAnsi="Times New Roman" w:cs="Times New Roman" w:hint="eastAsia"/>
+        </w:rPr>
+      </w:pPr>
+      <w:r>
+        <w:rPr>
+          <w:rFonts w:ascii="Times New Roman" w:hAnsi="Times New Roman" w:cs="Times New Roman"/>
+        </w:rPr>
+        <w:t>“</w:t>
+      </w:r>
+      <w:r>
+        <w:rPr>
+          <w:rFonts w:ascii="Times New Roman" w:hAnsi="Times New Roman" w:cs="Times New Roman"/>
+          <w:highlight w:val="yellow"/>
+        </w:rPr>
+        <w:t>between two countries</w:t>
+      </w:r>
+      <w:r>
+        <w:rPr>
+          <w:rFonts w:ascii="Times New Roman" w:hAnsi="Times New Roman" w:cs="Times New Roman"/>
+        </w:rPr>
+        <w:t>”</w:t>
+      </w:r>
+      <w:r>
+        <w:rPr>
+          <w:rFonts w:ascii="Times New Roman" w:hAnsi="Times New Roman" w:cs="Times New Roman" w:hint="eastAsia"/>
+        </w:rPr>
+        <w:t xml:space="preserve">:  between </w:t>
+      </w:r>
+      <w:r>
+        <w:rPr>
+          <w:rFonts w:ascii="Times New Roman" w:hAnsi="Times New Roman" w:cs="Times New Roman" w:hint="eastAsia"/>
+          <w:highlight w:val="green"/>
+        </w:rPr>
+        <w:t>the</w:t>
+      </w:r>
+      <w:r>
+        <w:rPr>
+          <w:rFonts w:ascii="Times New Roman" w:hAnsi="Times New Roman" w:cs="Times New Roman" w:hint="eastAsia"/>
+        </w:rPr>
+        <w:t xml:space="preserve"> two countries...</w:t>
+      </w:r>
+    </w:p>
+    <w:p>
+      <w:pPr>
+        <w:pStyle w:val="a6"/>
+        <w:numPr>
+          <w:ilvl w:val="0"/>
+          <w:numId w:val="6"/>
+        </w:numPr>
+        <w:rPr>
+          <w:rFonts w:ascii="Times New Roman" w:hAnsi="Times New Roman" w:cs="Times New Roman" w:hint="eastAsia"/>
+        </w:rPr>
+      </w:pPr>
+      <w:r>
+        <w:rPr>
+          <w:rFonts w:ascii="Times New Roman" w:hAnsi="Times New Roman" w:cs="Times New Roman" w:hint="eastAsia"/>
+          <w:highlight w:val="green"/>
+        </w:rPr>
+        <w:t>on</w:t>
+      </w:r>
+      <w:r>
+        <w:rPr>
+          <w:rFonts w:ascii="Times New Roman" w:hAnsi="Times New Roman" w:cs="Times New Roman" w:hint="eastAsia"/>
+        </w:rPr>
+        <w:t xml:space="preserve"> the consumption</w:t>
+      </w:r>
+    </w:p>
+    <w:p>
+      <w:pPr>
+        <w:pStyle w:val="a6"/>
+        <w:numPr>
+          <w:ilvl w:val="0"/>
+          <w:numId w:val="6"/>
+        </w:numPr>
+        <w:rPr>
+          <w:rFonts w:ascii="Times New Roman" w:hAnsi="Times New Roman" w:cs="Times New Roman" w:hint="eastAsia"/>
+        </w:rPr>
+      </w:pPr>
+      <w:r>
+        <w:rPr>
+          <w:rFonts w:ascii="Times New Roman" w:hAnsi="Times New Roman" w:cs="Times New Roman" w:hint="eastAsia"/>
+        </w:rPr>
+        <w:t>compared to...</w:t>
+      </w:r>
+    </w:p>
+    <w:p>
+      <w:pPr>
+        <w:pStyle w:val="a6"/>
+        <w:numPr>
+          <w:ilvl w:val="0"/>
+          <w:numId w:val="6"/>
+        </w:numPr>
+        <w:rPr>
+          <w:rFonts w:ascii="Times New Roman" w:hAnsi="Times New Roman" w:cs="Times New Roman" w:hint="eastAsia"/>
+        </w:rPr>
+      </w:pPr>
+      <w:r>
+        <w:rPr>
+          <w:rFonts w:ascii="Times New Roman" w:hAnsi="Times New Roman" w:cs="Times New Roman"/>
+        </w:rPr>
+        <w:t>“</w:t>
+      </w:r>
+      <w:r>
+        <w:rPr>
+          <w:rFonts w:ascii="Times New Roman" w:hAnsi="Times New Roman" w:cs="Times New Roman" w:hint="eastAsia"/>
+        </w:rPr>
+        <w:t>a little bit more thatn...</w:t>
+      </w:r>
+      <w:r>
+        <w:rPr>
+          <w:rFonts w:ascii="Times New Roman" w:hAnsi="Times New Roman" w:cs="Times New Roman"/>
+        </w:rPr>
+        <w:t>”</w:t>
+      </w:r>
+      <w:r>
+        <w:rPr>
+          <w:rFonts w:ascii="Times New Roman" w:hAnsi="Times New Roman" w:cs="Times New Roman" w:hint="eastAsia"/>
+        </w:rPr>
+        <w:t xml:space="preserve"> is colloquial, we should use </w:t>
+      </w:r>
+      <w:r>
+        <w:rPr>
+          <w:rFonts w:ascii="Times New Roman" w:hAnsi="Times New Roman" w:cs="Times New Roman"/>
+        </w:rPr>
+        <w:t>“</w:t>
+      </w:r>
+      <w:r>
+        <w:rPr>
+          <w:rFonts w:ascii="Times New Roman" w:hAnsi="Times New Roman" w:cs="Times New Roman" w:hint="eastAsia"/>
+        </w:rPr>
+        <w:t>just</w:t>
+      </w:r>
+      <w:r>
+        <w:rPr>
+          <w:rFonts w:ascii="Times New Roman" w:hAnsi="Times New Roman" w:cs="Times New Roman"/>
+        </w:rPr>
+        <w:t>”</w:t>
+      </w:r>
+      <w:r>
+        <w:rPr>
+          <w:rFonts w:ascii="Times New Roman" w:hAnsi="Times New Roman" w:cs="Times New Roman" w:hint="eastAsia"/>
+        </w:rPr>
+        <w:t xml:space="preserve"> instead.</w:t>
+      </w:r>
+      <w:r>
+        <w:rPr>
+          <w:rFonts w:ascii="Times New Roman" w:hAnsi="Times New Roman" w:cs="Times New Roman"/>
+        </w:rPr>
+        <w:br/>
+      </w:r>
+      <w:r>
+        <w:rPr>
+          <w:rFonts w:ascii="Times New Roman" w:hAnsi="Times New Roman" w:cs="Times New Roman" w:hint="eastAsia"/>
+          <w:b/>
+        </w:rPr>
+        <w:t>just</w:t>
+      </w:r>
+      <w:r>
+        <w:rPr>
+          <w:rFonts w:ascii="Times New Roman" w:hAnsi="Times New Roman" w:cs="Times New Roman" w:hint="eastAsia"/>
+        </w:rPr>
+        <w:t>: by a small amount.</w:t>
+      </w:r>
+    </w:p>
+    <w:p>
+      <w:pPr>
+        <w:pStyle w:val="a6"/>
+        <w:numPr>
+          <w:ilvl w:val="0"/>
+          <w:numId w:val="6"/>
+        </w:numPr>
+        <w:rPr>
+          <w:rFonts w:ascii="Times New Roman" w:hAnsi="Times New Roman" w:cs="Times New Roman" w:hint="eastAsia"/>
+        </w:rPr>
+      </w:pPr>
+      <w:r>
+        <w:rPr>
+          <w:rFonts w:ascii="Times New Roman" w:hAnsi="Times New Roman" w:cs="Times New Roman"/>
+        </w:rPr>
+        <w:t>“</w:t>
+      </w:r>
+      <w:r>
+        <w:rPr>
+          <w:rFonts w:ascii="Times New Roman" w:hAnsi="Times New Roman" w:cs="Times New Roman"/>
+        </w:rPr>
+        <w:t>People in UK spent around £400,000 on books while those in France spent £300,000.</w:t>
+      </w:r>
+      <w:r>
+        <w:rPr>
+          <w:rFonts w:ascii="Times New Roman" w:hAnsi="Times New Roman" w:cs="Times New Roman"/>
+        </w:rPr>
+        <w:t>”</w:t>
+      </w:r>
+      <w:r>
+        <w:rPr>
+          <w:rFonts w:ascii="Times New Roman" w:hAnsi="Times New Roman" w:cs="Times New Roman" w:hint="eastAsia"/>
+        </w:rPr>
+        <w:t>.</w:t>
+      </w:r>
+      <w:r>
+        <w:rPr>
+          <w:rFonts w:ascii="Times New Roman" w:hAnsi="Times New Roman" w:cs="Times New Roman"/>
+        </w:rPr>
+        <w:br/>
+      </w:r>
+      <w:r>
+        <w:rPr>
+          <w:rFonts w:ascii="Times New Roman" w:hAnsi="Times New Roman" w:cs="Times New Roman" w:hint="eastAsia"/>
+        </w:rPr>
+        <w:t xml:space="preserve">There are two </w:t>
+      </w:r>
+      <w:r>
+        <w:rPr>
+          <w:rFonts w:ascii="Times New Roman" w:hAnsi="Times New Roman" w:cs="Times New Roman"/>
+        </w:rPr>
+        <w:t>“</w:t>
+      </w:r>
+      <w:r>
+        <w:rPr>
+          <w:rFonts w:ascii="Times New Roman" w:hAnsi="Times New Roman" w:cs="Times New Roman" w:hint="eastAsia"/>
+        </w:rPr>
+        <w:t>spent</w:t>
+      </w:r>
+      <w:r>
+        <w:rPr>
+          <w:rFonts w:ascii="Times New Roman" w:hAnsi="Times New Roman" w:cs="Times New Roman"/>
+        </w:rPr>
+        <w:t>”</w:t>
+      </w:r>
+      <w:r>
+        <w:rPr>
+          <w:rFonts w:ascii="Times New Roman" w:hAnsi="Times New Roman" w:cs="Times New Roman" w:hint="eastAsia"/>
+        </w:rPr>
+        <w:t xml:space="preserve">s in this sentence, which is not encouraged in IELTS and </w:t>
+      </w:r>
+      <w:r>
+        <w:rPr>
+          <w:rFonts w:ascii="Times New Roman" w:hAnsi="Times New Roman" w:cs="Times New Roman" w:hint="eastAsia"/>
+        </w:rPr>
+        <w:t>leads to a lower band score.</w:t>
+      </w:r>
+    </w:p>
+    <w:p>
+      <w:pPr>
+        <w:pStyle w:val="a6"/>
+        <w:numPr>
+          <w:ilvl w:val="0"/>
+          <w:numId w:val="6"/>
+        </w:numPr>
+        <w:rPr>
+          <w:rFonts w:ascii="Times New Roman" w:hAnsi="Times New Roman" w:cs="Times New Roman" w:hint="eastAsia"/>
+        </w:rPr>
+      </w:pPr>
+      <w:r>
+        <w:rPr>
+          <w:rFonts w:ascii="Times New Roman" w:hAnsi="Times New Roman" w:cs="Times New Roman" w:hint="eastAsia"/>
+        </w:rPr>
+        <w:t xml:space="preserve">The second body paragraph is too short. In oder to make it lenghier, </w:t>
+      </w:r>
+      <w:r>
+        <w:rPr>
+          <w:rFonts w:ascii="Times New Roman" w:hAnsi="Times New Roman" w:cs="Times New Roman" w:hint="eastAsia"/>
+        </w:rPr>
+        <w:t>a</w:t>
+      </w:r>
+      <w:r>
+        <w:rPr>
+          <w:rFonts w:ascii="Times New Roman" w:hAnsi="Times New Roman" w:cs="Times New Roman" w:hint="eastAsia"/>
+        </w:rPr>
+        <w:t xml:space="preserve"> thesis should be added at the beginning of the second body paragraph; it is that </w:t>
+      </w:r>
+      <w:r>
+        <w:rPr>
+          <w:rFonts w:ascii="Times New Roman" w:hAnsi="Times New Roman" w:cs="Times New Roman"/>
+        </w:rPr>
+        <w:t>“</w:t>
+      </w:r>
+      <w:r>
+        <w:rPr>
+          <w:rFonts w:ascii="Times New Roman" w:hAnsi="Times New Roman" w:cs="Times New Roman" w:hint="eastAsia"/>
+        </w:rPr>
+        <w:t>On the other hand, French consumed more on remaining goods than British.</w:t>
+      </w:r>
+      <w:r>
+        <w:rPr>
+          <w:rFonts w:ascii="Times New Roman" w:hAnsi="Times New Roman" w:cs="Times New Roman"/>
+        </w:rPr>
+        <w:t>”</w:t>
+      </w:r>
+      <w:r>
+        <w:rPr>
+          <w:rFonts w:ascii="Times New Roman" w:hAnsi="Times New Roman" w:cs="Times New Roman" w:hint="eastAsia"/>
+        </w:rPr>
+        <w:t xml:space="preserve"> Then the point should be supported by detailed data. </w:t>
+      </w:r>
+    </w:p>
+    <w:p>
+      <w:pPr>
+        <w:rPr>
+          <w:rFonts w:ascii="Times New Roman" w:hAnsi="Times New Roman" w:cs="Times New Roman" w:hint="eastAsia"/>
+          <w:b/>
+          <w:i/>
+        </w:rPr>
+      </w:pPr>
+      <w:r>
+        <w:rPr>
+          <w:rFonts w:ascii="Times New Roman" w:hAnsi="Times New Roman" w:cs="Times New Roman" w:hint="eastAsia"/>
+          <w:b/>
+          <w:i/>
+        </w:rPr>
+        <w:t>My report 3 after being improved.</w:t>
+      </w:r>
+    </w:p>
+    <w:p>
+      <w:pPr>
+        <w:rPr>
+          <w:rFonts w:ascii="Times New Roman" w:hAnsi="Times New Roman" w:cs="Times New Roman" w:hint="eastAsia"/>
+        </w:rPr>
+      </w:pPr>
+      <w:r>
+        <w:rPr>
+          <w:rFonts w:ascii="Times New Roman" w:hAnsi="Times New Roman" w:cs="Times New Roman" w:hint="eastAsia"/>
+        </w:rPr>
+        <w:t>The bar chart illustrates the information of the amount of money spent on cunsumer goods, which are cars, computers, books, perfume and cameras, in the UK and France in 2010. Units are measured in pounds sterling.</w:t>
+      </w:r>
+    </w:p>
+    <w:p>
+      <w:pPr>
+        <w:rPr>
+          <w:rFonts w:ascii="Times New Roman" w:hAnsi="Times New Roman" w:cs="Times New Roman" w:hint="eastAsia"/>
+        </w:rPr>
+      </w:pPr>
+      <w:r>
+        <w:rPr>
+          <w:rFonts w:ascii="Times New Roman" w:hAnsi="Times New Roman" w:cs="Times New Roman" w:hint="eastAsia"/>
+        </w:rPr>
+        <w:t xml:space="preserve">Overall, </w:t>
+      </w:r>
+      <w:r>
+        <w:rPr>
+          <w:rFonts w:ascii="Times New Roman" w:hAnsi="Times New Roman" w:cs="Times New Roman" w:hint="eastAsia"/>
+        </w:rPr>
+        <w:t xml:space="preserve">Britain spent more than France did and the most money for the both countries was used on cars. </w:t>
+      </w:r>
+      <w:r>
+        <w:rPr>
+          <w:rFonts w:ascii="Times New Roman" w:hAnsi="Times New Roman" w:cs="Times New Roman" w:hint="eastAsia"/>
+        </w:rPr>
+        <w:t xml:space="preserve">Whereas, the least money spent on perfume in the UK compared to cameras in France. </w:t>
+      </w:r>
+      <w:r>
+        <w:rPr>
+          <w:rFonts w:ascii="Times New Roman" w:hAnsi="Times New Roman" w:cs="Times New Roman" w:hint="eastAsia"/>
+        </w:rPr>
+        <w:t>In addition, the most significant difference of expenditure between two countries was on cameras.</w:t>
+      </w:r>
+    </w:p>
+    <w:p>
+      <w:pPr>
+        <w:rPr>
+          <w:rFonts w:ascii="Times New Roman" w:hAnsi="Times New Roman" w:cs="Times New Roman" w:hint="eastAsia"/>
         </w:rPr>
       </w:pPr>
       <w:bookmarkStart w:id="0" w:name="_GoBack"/>
       <w:bookmarkEnd w:id="0"/>
+    </w:p>
+    <w:p>
+      <w:pPr>
+        <w:rPr>
+          <w:rFonts w:ascii="Times New Roman" w:hAnsi="Times New Roman" w:cs="Times New Roman" w:hint="eastAsia"/>
+        </w:rPr>
+      </w:pPr>
+    </w:p>
+    <w:p>
+      <w:pPr>
+        <w:rPr>
+          <w:rFonts w:ascii="Times New Roman" w:hAnsi="Times New Roman" w:cs="Times New Roman" w:hint="eastAsia"/>
+        </w:rPr>
+      </w:pPr>
+      <w:r>
+        <w:rPr>
+          <w:rFonts w:ascii="Times New Roman" w:hAnsi="Times New Roman" w:cs="Times New Roman"/>
+        </w:rPr>
+        <w:br/>
+      </w:r>
+    </w:p>
+    <w:p>
+      <w:pPr>
+        <w:rPr>
+          <w:rFonts w:ascii="Times New Roman" w:hAnsi="Times New Roman" w:cs="Times New Roman"/>
+        </w:rPr>
+      </w:pPr>
+    </w:p>
+    <w:p>
+      <w:pPr>
+        <w:rPr>
+          <w:rFonts w:ascii="Times New Roman" w:hAnsi="Times New Roman" w:cs="Times New Roman"/>
+        </w:rPr>
+      </w:pPr>
     </w:p>
     <w:p>
       <w:pPr>
@@ -5343,6 +6380,92 @@
 <file path=word/numbering.xml><?xml version="1.0" encoding="utf-8"?>
 <w:numbering xmlns:wpc="http://schemas.microsoft.com/office/word/2010/wordprocessingCanvas" xmlns:mc="http://schemas.openxmlformats.org/markup-compatibility/2006" xmlns:o="urn:schemas-microsoft-com:office:office" xmlns:r="http://schemas.openxmlformats.org/officeDocument/2006/relationships" xmlns:m="http://schemas.openxmlformats.org/officeDocument/2006/math" xmlns:v="urn:schemas-microsoft-com:vml" xmlns:wp14="http://schemas.microsoft.com/office/word/2010/wordprocessingDrawing" xmlns:wp="http://schemas.openxmlformats.org/drawingml/2006/wordprocessingDrawing" xmlns:w10="urn:schemas-microsoft-com:office:word" xmlns:w="http://schemas.openxmlformats.org/wordprocessingml/2006/main" xmlns:w14="http://schemas.microsoft.com/office/word/2010/wordml" xmlns:wpg="http://schemas.microsoft.com/office/word/2010/wordprocessingGroup" xmlns:wpi="http://schemas.microsoft.com/office/word/2010/wordprocessingInk" xmlns:wne="http://schemas.microsoft.com/office/word/2006/wordml" xmlns:wps="http://schemas.microsoft.com/office/word/2010/wordprocessingShape" mc:Ignorable="w14 wp14">
   <w:abstractNum w:abstractNumId="0">
+    <w:nsid w:val="049D2E71"/>
+    <w:multiLevelType w:val="hybridMultilevel"/>
+    <w:tmpl w:val="D0D4D2B4"/>
+    <w:lvl w:ilvl="0" w:tplc="0409000F">
+      <w:start w:val="1"/>
+      <w:numFmt w:val="decimal"/>
+      <w:lvlText w:val="%1."/>
+      <w:lvlJc w:val="left"/>
+      <w:pPr>
+        <w:ind w:left="360" w:hanging="360"/>
+      </w:pPr>
+    </w:lvl>
+    <w:lvl w:ilvl="1" w:tplc="04090019" w:tentative="1">
+      <w:start w:val="1"/>
+      <w:numFmt w:val="lowerLetter"/>
+      <w:lvlText w:val="%2."/>
+      <w:lvlJc w:val="left"/>
+      <w:pPr>
+        <w:ind w:left="1080" w:hanging="360"/>
+      </w:pPr>
+    </w:lvl>
+    <w:lvl w:ilvl="2" w:tplc="0409001B" w:tentative="1">
+      <w:start w:val="1"/>
+      <w:numFmt w:val="lowerRoman"/>
+      <w:lvlText w:val="%3."/>
+      <w:lvlJc w:val="right"/>
+      <w:pPr>
+        <w:ind w:left="1800" w:hanging="180"/>
+      </w:pPr>
+    </w:lvl>
+    <w:lvl w:ilvl="3" w:tplc="0409000F" w:tentative="1">
+      <w:start w:val="1"/>
+      <w:numFmt w:val="decimal"/>
+      <w:lvlText w:val="%4."/>
+      <w:lvlJc w:val="left"/>
+      <w:pPr>
+        <w:ind w:left="2520" w:hanging="360"/>
+      </w:pPr>
+    </w:lvl>
+    <w:lvl w:ilvl="4" w:tplc="04090019" w:tentative="1">
+      <w:start w:val="1"/>
+      <w:numFmt w:val="lowerLetter"/>
+      <w:lvlText w:val="%5."/>
+      <w:lvlJc w:val="left"/>
+      <w:pPr>
+        <w:ind w:left="3240" w:hanging="360"/>
+      </w:pPr>
+    </w:lvl>
+    <w:lvl w:ilvl="5" w:tplc="0409001B" w:tentative="1">
+      <w:start w:val="1"/>
+      <w:numFmt w:val="lowerRoman"/>
+      <w:lvlText w:val="%6."/>
+      <w:lvlJc w:val="right"/>
+      <w:pPr>
+        <w:ind w:left="3960" w:hanging="180"/>
+      </w:pPr>
+    </w:lvl>
+    <w:lvl w:ilvl="6" w:tplc="0409000F" w:tentative="1">
+      <w:start w:val="1"/>
+      <w:numFmt w:val="decimal"/>
+      <w:lvlText w:val="%7."/>
+      <w:lvlJc w:val="left"/>
+      <w:pPr>
+        <w:ind w:left="4680" w:hanging="360"/>
+      </w:pPr>
+    </w:lvl>
+    <w:lvl w:ilvl="7" w:tplc="04090019" w:tentative="1">
+      <w:start w:val="1"/>
+      <w:numFmt w:val="lowerLetter"/>
+      <w:lvlText w:val="%8."/>
+      <w:lvlJc w:val="left"/>
+      <w:pPr>
+        <w:ind w:left="5400" w:hanging="360"/>
+      </w:pPr>
+    </w:lvl>
+    <w:lvl w:ilvl="8" w:tplc="0409001B" w:tentative="1">
+      <w:start w:val="1"/>
+      <w:numFmt w:val="lowerRoman"/>
+      <w:lvlText w:val="%9."/>
+      <w:lvlJc w:val="right"/>
+      <w:pPr>
+        <w:ind w:left="6120" w:hanging="180"/>
+      </w:pPr>
+    </w:lvl>
+  </w:abstractNum>
+  <w:abstractNum w:abstractNumId="1">
     <w:nsid w:val="05E6080A"/>
     <w:multiLevelType w:val="hybridMultilevel"/>
     <w:tmpl w:val="6CA8D9EA"/>
@@ -5431,7 +6554,7 @@
       </w:pPr>
     </w:lvl>
   </w:abstractNum>
-  <w:abstractNum w:abstractNumId="1">
+  <w:abstractNum w:abstractNumId="2">
     <w:nsid w:val="1B141171"/>
     <w:multiLevelType w:val="hybridMultilevel"/>
     <w:tmpl w:val="849237CE"/>
@@ -5520,7 +6643,7 @@
       </w:pPr>
     </w:lvl>
   </w:abstractNum>
-  <w:abstractNum w:abstractNumId="2">
+  <w:abstractNum w:abstractNumId="3">
     <w:nsid w:val="2704799B"/>
     <w:multiLevelType w:val="hybridMultilevel"/>
     <w:tmpl w:val="8B20E512"/>
@@ -5609,7 +6732,7 @@
       </w:pPr>
     </w:lvl>
   </w:abstractNum>
-  <w:abstractNum w:abstractNumId="3">
+  <w:abstractNum w:abstractNumId="4">
     <w:nsid w:val="5FE6397B"/>
     <w:multiLevelType w:val="hybridMultilevel"/>
     <w:tmpl w:val="54860AC4"/>
@@ -5698,7 +6821,7 @@
       </w:pPr>
     </w:lvl>
   </w:abstractNum>
-  <w:abstractNum w:abstractNumId="4">
+  <w:abstractNum w:abstractNumId="5">
     <w:nsid w:val="74703310"/>
     <w:multiLevelType w:val="hybridMultilevel"/>
     <w:tmpl w:val="A4CEF8F8"/>
@@ -5788,19 +6911,22 @@
     </w:lvl>
   </w:abstractNum>
   <w:num w:numId="1">
-    <w:abstractNumId w:val="0"/>
+    <w:abstractNumId w:val="1"/>
   </w:num>
   <w:num w:numId="2">
+    <w:abstractNumId w:val="5"/>
+  </w:num>
+  <w:num w:numId="3">
     <w:abstractNumId w:val="4"/>
   </w:num>
-  <w:num w:numId="3">
+  <w:num w:numId="4">
+    <w:abstractNumId w:val="2"/>
+  </w:num>
+  <w:num w:numId="5">
     <w:abstractNumId w:val="3"/>
   </w:num>
-  <w:num w:numId="4">
-    <w:abstractNumId w:val="1"/>
-  </w:num>
-  <w:num w:numId="5">
-    <w:abstractNumId w:val="2"/>
+  <w:num w:numId="6">
+    <w:abstractNumId w:val="0"/>
   </w:num>
 </w:numbering>
 </file>
@@ -6568,6 +7694,18 @@
       <w:u w:val="single"/>
     </w:rPr>
   </w:style>
+  <w:style w:type="character" w:styleId="ae">
+    <w:name w:val="FollowedHyperlink"/>
+    <w:basedOn w:val="a0"/>
+    <w:uiPriority w:val="99"/>
+    <w:semiHidden/>
+    <w:unhideWhenUsed/>
+    <w:rsid w:val="0078487D"/>
+    <w:rPr>
+      <w:color w:val="96607D" w:themeColor="followedHyperlink"/>
+      <w:u w:val="single"/>
+    </w:rPr>
+  </w:style>
 </w:styles>
 </file>
 
@@ -7334,6 +8472,18 @@
       <w:u w:val="single"/>
     </w:rPr>
   </w:style>
+  <w:style w:type="character" w:styleId="ae">
+    <w:name w:val="FollowedHyperlink"/>
+    <w:basedOn w:val="a0"/>
+    <w:uiPriority w:val="99"/>
+    <w:semiHidden/>
+    <w:unhideWhenUsed/>
+    <w:rsid w:val="0078487D"/>
+    <w:rPr>
+      <w:color w:val="96607D" w:themeColor="followedHyperlink"/>
+      <w:u w:val="single"/>
+    </w:rPr>
+  </w:style>
 </w:styles>
 </file>
 
@@ -7626,7 +8776,7 @@
   <a:extraClrSchemeLst/>
   <a:extLst>
     <a:ext uri="{05A4C25C-085E-4340-85A3-A5531E510DB2}">
-      <thm15:themeFamily xmlns="" xmlns:thm15="http://schemas.microsoft.com/office/thememl/2012/main" name="Office Theme" id="{62F939B6-93AF-4DB8-9C6B-D6C7DFDC589F}" vid="{4A3C46E8-61CC-4603-A589-7422A47A8E4A}"/>
+      <thm15:themeFamily xmlns:thm15="http://schemas.microsoft.com/office/thememl/2012/main" xmlns="" name="Office Theme" id="{62F939B6-93AF-4DB8-9C6B-D6C7DFDC589F}" vid="{4A3C46E8-61CC-4603-A589-7422A47A8E4A}"/>
     </a:ext>
   </a:extLst>
 </a:theme>
@@ -7637,7 +8787,7 @@
 </file>
 
 <file path=customXml/itemProps1.xml><?xml version="1.0" encoding="utf-8"?>
-<ds:datastoreItem xmlns:ds="http://schemas.openxmlformats.org/officeDocument/2006/customXml" ds:itemID="{060EAB4A-33A4-4603-9AA2-567F1EC36345}">
+<ds:datastoreItem xmlns:ds="http://schemas.openxmlformats.org/officeDocument/2006/customXml" ds:itemID="{E3D54382-7A5E-4335-AB18-2493CD58697F}">
   <ds:schemaRefs>
     <ds:schemaRef ds:uri="http://schemas.openxmlformats.org/officeDocument/2006/bibliography"/>
   </ds:schemaRefs>

</xml_diff>

<commit_message>
writing essays is not as easy as reading ones.
</commit_message>
<xml_diff>
--- a/IELTS Notes/Writing Exercises and Analyses.docx
+++ b/IELTS Notes/Writing Exercises and Analyses.docx
@@ -5629,7 +5629,7 @@
     <w:p>
       <w:pPr>
         <w:rPr>
-          <w:rFonts w:ascii="Times New Roman" w:hAnsi="Times New Roman" w:cs="Times New Roman" w:hint="eastAsia"/>
+          <w:rFonts w:ascii="Times New Roman" w:hAnsi="Times New Roman" w:cs="Times New Roman"/>
         </w:rPr>
       </w:pPr>
       <w:r>
@@ -5740,7 +5740,7 @@
     <w:p>
       <w:pPr>
         <w:rPr>
-          <w:rFonts w:ascii="Times New Roman" w:hAnsi="Times New Roman" w:cs="Times New Roman" w:hint="eastAsia"/>
+          <w:rFonts w:ascii="Times New Roman" w:hAnsi="Times New Roman" w:cs="Times New Roman"/>
           <w:b/>
           <w:i/>
         </w:rPr>
@@ -5770,7 +5770,7 @@
           <w:numId w:val="6"/>
         </w:numPr>
         <w:rPr>
-          <w:rFonts w:ascii="Times New Roman" w:hAnsi="Times New Roman" w:cs="Times New Roman" w:hint="eastAsia"/>
+          <w:rFonts w:ascii="Times New Roman" w:hAnsi="Times New Roman" w:cs="Times New Roman"/>
         </w:rPr>
       </w:pPr>
       <w:r>
@@ -5819,7 +5819,7 @@
           <w:numId w:val="6"/>
         </w:numPr>
         <w:rPr>
-          <w:rFonts w:ascii="Times New Roman" w:hAnsi="Times New Roman" w:cs="Times New Roman" w:hint="eastAsia"/>
+          <w:rFonts w:ascii="Times New Roman" w:hAnsi="Times New Roman" w:cs="Times New Roman"/>
         </w:rPr>
       </w:pPr>
       <w:r>
@@ -5861,7 +5861,7 @@
           <w:numId w:val="6"/>
         </w:numPr>
         <w:rPr>
-          <w:rFonts w:ascii="Times New Roman" w:hAnsi="Times New Roman" w:cs="Times New Roman" w:hint="eastAsia"/>
+          <w:rFonts w:ascii="Times New Roman" w:hAnsi="Times New Roman" w:cs="Times New Roman"/>
         </w:rPr>
       </w:pPr>
       <w:r>
@@ -5910,7 +5910,7 @@
           <w:numId w:val="6"/>
         </w:numPr>
         <w:rPr>
-          <w:rFonts w:ascii="Times New Roman" w:hAnsi="Times New Roman" w:cs="Times New Roman" w:hint="eastAsia"/>
+          <w:rFonts w:ascii="Times New Roman" w:hAnsi="Times New Roman" w:cs="Times New Roman"/>
         </w:rPr>
       </w:pPr>
       <w:r>
@@ -5960,7 +5960,7 @@
           <w:numId w:val="6"/>
         </w:numPr>
         <w:rPr>
-          <w:rFonts w:ascii="Times New Roman" w:hAnsi="Times New Roman" w:cs="Times New Roman" w:hint="eastAsia"/>
+          <w:rFonts w:ascii="Times New Roman" w:hAnsi="Times New Roman" w:cs="Times New Roman"/>
         </w:rPr>
       </w:pPr>
       <w:r>
@@ -5985,7 +5985,7 @@
           <w:numId w:val="6"/>
         </w:numPr>
         <w:rPr>
-          <w:rFonts w:ascii="Times New Roman" w:hAnsi="Times New Roman" w:cs="Times New Roman" w:hint="eastAsia"/>
+          <w:rFonts w:ascii="Times New Roman" w:hAnsi="Times New Roman" w:cs="Times New Roman"/>
         </w:rPr>
       </w:pPr>
       <w:r>
@@ -6003,7 +6003,7 @@
           <w:numId w:val="6"/>
         </w:numPr>
         <w:rPr>
-          <w:rFonts w:ascii="Times New Roman" w:hAnsi="Times New Roman" w:cs="Times New Roman" w:hint="eastAsia"/>
+          <w:rFonts w:ascii="Times New Roman" w:hAnsi="Times New Roman" w:cs="Times New Roman"/>
         </w:rPr>
       </w:pPr>
       <w:r>
@@ -6082,26 +6082,14 @@
           <w:numId w:val="6"/>
         </w:numPr>
         <w:rPr>
-          <w:rFonts w:ascii="Times New Roman" w:hAnsi="Times New Roman" w:cs="Times New Roman" w:hint="eastAsia"/>
-        </w:rPr>
-      </w:pPr>
-      <w:r>
-        <w:rPr>
-          <w:rFonts w:ascii="Times New Roman" w:hAnsi="Times New Roman" w:cs="Times New Roman"/>
-        </w:rPr>
-        <w:t>“</w:t>
-      </w:r>
-      <w:r>
-        <w:rPr>
-          <w:rFonts w:ascii="Times New Roman" w:hAnsi="Times New Roman" w:cs="Times New Roman"/>
-        </w:rPr>
-        <w:t>People in UK spent around £400,000 on books while those in France spent £300,000.</w:t>
-      </w:r>
-      <w:r>
-        <w:rPr>
-          <w:rFonts w:ascii="Times New Roman" w:hAnsi="Times New Roman" w:cs="Times New Roman"/>
-        </w:rPr>
-        <w:t>”</w:t>
+          <w:rFonts w:ascii="Times New Roman" w:hAnsi="Times New Roman" w:cs="Times New Roman"/>
+        </w:rPr>
+      </w:pPr>
+      <w:r>
+        <w:rPr>
+          <w:rFonts w:ascii="Times New Roman" w:hAnsi="Times New Roman" w:cs="Times New Roman"/>
+        </w:rPr>
+        <w:t>“People in UK spent around £400,000 on books while those in France spent £300,000.”</w:t>
       </w:r>
       <w:r>
         <w:rPr>
@@ -6160,7 +6148,7 @@
           <w:numId w:val="6"/>
         </w:numPr>
         <w:rPr>
-          <w:rFonts w:ascii="Times New Roman" w:hAnsi="Times New Roman" w:cs="Times New Roman" w:hint="eastAsia"/>
+          <w:rFonts w:ascii="Times New Roman" w:hAnsi="Times New Roman" w:cs="Times New Roman"/>
         </w:rPr>
       </w:pPr>
       <w:r>
@@ -6209,7 +6197,7 @@
     <w:p>
       <w:pPr>
         <w:rPr>
-          <w:rFonts w:ascii="Times New Roman" w:hAnsi="Times New Roman" w:cs="Times New Roman" w:hint="eastAsia"/>
+          <w:rFonts w:ascii="Times New Roman" w:hAnsi="Times New Roman" w:cs="Times New Roman"/>
           <w:b/>
           <w:i/>
         </w:rPr>
@@ -6226,7 +6214,7 @@
     <w:p>
       <w:pPr>
         <w:rPr>
-          <w:rFonts w:ascii="Times New Roman" w:hAnsi="Times New Roman" w:cs="Times New Roman" w:hint="eastAsia"/>
+          <w:rFonts w:ascii="Times New Roman" w:hAnsi="Times New Roman" w:cs="Times New Roman"/>
         </w:rPr>
       </w:pPr>
       <w:r>
@@ -6239,7 +6227,7 @@
     <w:p>
       <w:pPr>
         <w:rPr>
-          <w:rFonts w:ascii="Times New Roman" w:hAnsi="Times New Roman" w:cs="Times New Roman" w:hint="eastAsia"/>
+          <w:rFonts w:ascii="Times New Roman" w:hAnsi="Times New Roman" w:cs="Times New Roman"/>
         </w:rPr>
       </w:pPr>
       <w:r>
@@ -6273,28 +6261,220 @@
           <w:rFonts w:ascii="Times New Roman" w:hAnsi="Times New Roman" w:cs="Times New Roman" w:hint="eastAsia"/>
         </w:rPr>
       </w:pPr>
+      <w:r>
+        <w:rPr>
+          <w:rFonts w:ascii="Times New Roman" w:hAnsi="Times New Roman" w:cs="Times New Roman" w:hint="eastAsia"/>
+        </w:rPr>
+        <w:t xml:space="preserve">In terms of cars, consumers in the UK spent more than those in France, the expenditure of two countries were </w:t>
+      </w:r>
+      <w:r>
+        <w:rPr>
+          <w:rFonts w:ascii="Times New Roman" w:hAnsi="Times New Roman" w:cs="Times New Roman"/>
+        </w:rPr>
+        <w:t>£</w:t>
+      </w:r>
+      <w:r>
+        <w:rPr>
+          <w:rFonts w:ascii="Times New Roman" w:hAnsi="Times New Roman" w:cs="Times New Roman" w:hint="eastAsia"/>
+        </w:rPr>
+        <w:t xml:space="preserve">450,000 and </w:t>
+      </w:r>
+      <w:r>
+        <w:rPr>
+          <w:rFonts w:ascii="Times New Roman" w:hAnsi="Times New Roman" w:cs="Times New Roman"/>
+        </w:rPr>
+        <w:t>£</w:t>
+      </w:r>
+      <w:r>
+        <w:rPr>
+          <w:rFonts w:ascii="Times New Roman" w:hAnsi="Times New Roman" w:cs="Times New Roman" w:hint="eastAsia"/>
+        </w:rPr>
+        <w:t xml:space="preserve">400,000, respectively. </w:t>
+      </w:r>
+      <w:r>
+        <w:rPr>
+          <w:rFonts w:ascii="Times New Roman" w:hAnsi="Times New Roman" w:cs="Times New Roman" w:hint="eastAsia"/>
+        </w:rPr>
+        <w:t xml:space="preserve">Similarly, British spent approximately </w:t>
+      </w:r>
+      <w:r>
+        <w:rPr>
+          <w:rFonts w:ascii="Times New Roman" w:hAnsi="Times New Roman" w:cs="Times New Roman"/>
+        </w:rPr>
+        <w:t>£</w:t>
+      </w:r>
+      <w:r>
+        <w:rPr>
+          <w:rFonts w:ascii="Times New Roman" w:hAnsi="Times New Roman" w:cs="Times New Roman" w:hint="eastAsia"/>
+        </w:rPr>
+        <w:t xml:space="preserve">400,000 on books which was rather higher than </w:t>
+      </w:r>
+      <w:r>
+        <w:rPr>
+          <w:rFonts w:ascii="Times New Roman" w:hAnsi="Times New Roman" w:cs="Times New Roman"/>
+        </w:rPr>
+        <w:t>£</w:t>
+      </w:r>
+      <w:r>
+        <w:rPr>
+          <w:rFonts w:ascii="Times New Roman" w:hAnsi="Times New Roman" w:cs="Times New Roman" w:hint="eastAsia"/>
+        </w:rPr>
+        <w:t>300,000 paid out by Franch.</w:t>
+      </w:r>
+      <w:r>
+        <w:rPr>
+          <w:rFonts w:ascii="Times New Roman" w:hAnsi="Times New Roman" w:cs="Times New Roman" w:hint="eastAsia"/>
+        </w:rPr>
+        <w:t xml:space="preserve"> </w:t>
+      </w:r>
+      <w:r>
+        <w:rPr>
+          <w:rFonts w:ascii="Times New Roman" w:hAnsi="Times New Roman" w:cs="Times New Roman" w:hint="eastAsia"/>
+        </w:rPr>
+        <w:t>Furthermore, the expenditure of cameras in the UK</w:t>
+      </w:r>
+      <w:r>
+        <w:rPr>
+          <w:rFonts w:ascii="Times New Roman" w:hAnsi="Times New Roman" w:cs="Times New Roman" w:hint="eastAsia"/>
+        </w:rPr>
+        <w:t xml:space="preserve">(above </w:t>
+      </w:r>
+      <w:r>
+        <w:rPr>
+          <w:rFonts w:ascii="Times New Roman" w:hAnsi="Times New Roman" w:cs="Times New Roman"/>
+        </w:rPr>
+        <w:t>£</w:t>
+      </w:r>
+      <w:r>
+        <w:rPr>
+          <w:rFonts w:ascii="Times New Roman" w:hAnsi="Times New Roman" w:cs="Times New Roman" w:hint="eastAsia"/>
+        </w:rPr>
+        <w:t>350,000)</w:t>
+      </w:r>
+      <w:r>
+        <w:rPr>
+          <w:rFonts w:ascii="Times New Roman" w:hAnsi="Times New Roman" w:cs="Times New Roman" w:hint="eastAsia"/>
+        </w:rPr>
+        <w:t xml:space="preserve"> was over double that of France</w:t>
+      </w:r>
+      <w:r>
+        <w:rPr>
+          <w:rFonts w:ascii="Times New Roman" w:hAnsi="Times New Roman" w:cs="Times New Roman" w:hint="eastAsia"/>
+        </w:rPr>
+        <w:t>(</w:t>
+      </w:r>
+      <w:r>
+        <w:rPr>
+          <w:rFonts w:ascii="Times New Roman" w:hAnsi="Times New Roman" w:cs="Times New Roman"/>
+        </w:rPr>
+        <w:t>£</w:t>
+      </w:r>
+      <w:r>
+        <w:rPr>
+          <w:rFonts w:ascii="Times New Roman" w:hAnsi="Times New Roman" w:cs="Times New Roman" w:hint="eastAsia"/>
+        </w:rPr>
+        <w:t>150,000)</w:t>
+      </w:r>
+      <w:r>
+        <w:rPr>
+          <w:rFonts w:ascii="Times New Roman" w:hAnsi="Times New Roman" w:cs="Times New Roman" w:hint="eastAsia"/>
+        </w:rPr>
+        <w:t xml:space="preserve">. </w:t>
+      </w:r>
+    </w:p>
+    <w:p>
+      <w:pPr>
+        <w:rPr>
+          <w:rFonts w:ascii="Times New Roman" w:hAnsi="Times New Roman" w:cs="Times New Roman"/>
+        </w:rPr>
+      </w:pPr>
+      <w:r>
+        <w:rPr>
+          <w:rFonts w:ascii="Times New Roman" w:hAnsi="Times New Roman" w:cs="Times New Roman" w:hint="eastAsia"/>
+        </w:rPr>
+        <w:lastRenderedPageBreak/>
+        <w:t xml:space="preserve">On the other hand, French spent more on the remaining two good than British. </w:t>
+      </w:r>
+      <w:r>
+        <w:rPr>
+          <w:rFonts w:ascii="Times New Roman" w:hAnsi="Times New Roman" w:cs="Times New Roman" w:hint="eastAsia"/>
+        </w:rPr>
+        <w:t xml:space="preserve">The amount of money that buyers in France spent on </w:t>
+      </w:r>
+      <w:r>
+        <w:rPr>
+          <w:rFonts w:ascii="Times New Roman" w:hAnsi="Times New Roman" w:cs="Times New Roman" w:hint="eastAsia"/>
+        </w:rPr>
+        <w:t>computers</w:t>
+      </w:r>
+      <w:r>
+        <w:rPr>
+          <w:rFonts w:ascii="Times New Roman" w:hAnsi="Times New Roman" w:cs="Times New Roman" w:hint="eastAsia"/>
+        </w:rPr>
+        <w:t xml:space="preserve"> was around </w:t>
+      </w:r>
+      <w:r>
+        <w:rPr>
+          <w:rFonts w:ascii="Times New Roman" w:hAnsi="Times New Roman" w:cs="Times New Roman"/>
+        </w:rPr>
+        <w:t>£</w:t>
+      </w:r>
+      <w:r>
+        <w:rPr>
+          <w:rFonts w:ascii="Times New Roman" w:hAnsi="Times New Roman" w:cs="Times New Roman" w:hint="eastAsia"/>
+        </w:rPr>
+        <w:t xml:space="preserve">375,000 as opposed to </w:t>
+      </w:r>
+      <w:r>
+        <w:rPr>
+          <w:rFonts w:ascii="Times New Roman" w:hAnsi="Times New Roman" w:cs="Times New Roman" w:hint="eastAsia"/>
+        </w:rPr>
+        <w:t xml:space="preserve">the exact </w:t>
+      </w:r>
+      <w:r>
+        <w:rPr>
+          <w:rFonts w:ascii="Times New Roman" w:hAnsi="Times New Roman" w:cs="Times New Roman"/>
+        </w:rPr>
+        <w:t>£</w:t>
+      </w:r>
+      <w:r>
+        <w:rPr>
+          <w:rFonts w:ascii="Times New Roman" w:hAnsi="Times New Roman" w:cs="Times New Roman" w:hint="eastAsia"/>
+        </w:rPr>
+        <w:t xml:space="preserve">350,000 in the UK. </w:t>
+      </w:r>
+      <w:r>
+        <w:rPr>
+          <w:rFonts w:ascii="Times New Roman" w:hAnsi="Times New Roman" w:cs="Times New Roman" w:hint="eastAsia"/>
+        </w:rPr>
+        <w:t xml:space="preserve">The expenditure of perfume was </w:t>
+      </w:r>
+      <w:r>
+        <w:rPr>
+          <w:rFonts w:ascii="Times New Roman" w:hAnsi="Times New Roman" w:cs="Times New Roman"/>
+        </w:rPr>
+        <w:t>£</w:t>
+      </w:r>
+      <w:r>
+        <w:rPr>
+          <w:rFonts w:ascii="Times New Roman" w:hAnsi="Times New Roman" w:cs="Times New Roman" w:hint="eastAsia"/>
+        </w:rPr>
+        <w:t xml:space="preserve">200,000 in France and less than </w:t>
+      </w:r>
+      <w:r>
+        <w:rPr>
+          <w:rFonts w:ascii="Times New Roman" w:hAnsi="Times New Roman" w:cs="Times New Roman"/>
+        </w:rPr>
+        <w:t>£</w:t>
+      </w:r>
+      <w:r>
+        <w:rPr>
+          <w:rFonts w:ascii="Times New Roman" w:hAnsi="Times New Roman" w:cs="Times New Roman" w:hint="eastAsia"/>
+        </w:rPr>
+        <w:t>150,000 in Britain.</w:t>
+      </w:r>
       <w:bookmarkStart w:id="0" w:name="_GoBack"/>
       <w:bookmarkEnd w:id="0"/>
-    </w:p>
-    <w:p>
-      <w:pPr>
-        <w:rPr>
-          <w:rFonts w:ascii="Times New Roman" w:hAnsi="Times New Roman" w:cs="Times New Roman" w:hint="eastAsia"/>
-        </w:rPr>
-      </w:pPr>
-    </w:p>
-    <w:p>
-      <w:pPr>
-        <w:rPr>
-          <w:rFonts w:ascii="Times New Roman" w:hAnsi="Times New Roman" w:cs="Times New Roman" w:hint="eastAsia"/>
-        </w:rPr>
-      </w:pPr>
-      <w:r>
-        <w:rPr>
-          <w:rFonts w:ascii="Times New Roman" w:hAnsi="Times New Roman" w:cs="Times New Roman"/>
-        </w:rPr>
-        <w:br/>
-      </w:r>
     </w:p>
     <w:p>
       <w:pPr>
@@ -8787,7 +8967,7 @@
 </file>
 
 <file path=customXml/itemProps1.xml><?xml version="1.0" encoding="utf-8"?>
-<ds:datastoreItem xmlns:ds="http://schemas.openxmlformats.org/officeDocument/2006/customXml" ds:itemID="{E3D54382-7A5E-4335-AB18-2493CD58697F}">
+<ds:datastoreItem xmlns:ds="http://schemas.openxmlformats.org/officeDocument/2006/customXml" ds:itemID="{5AE54759-4C12-4F2C-9884-3AEEAB915570}">
   <ds:schemaRefs>
     <ds:schemaRef ds:uri="http://schemas.openxmlformats.org/officeDocument/2006/bibliography"/>
   </ds:schemaRefs>

</xml_diff>

<commit_message>
a complicated bar chart
</commit_message>
<xml_diff>
--- a/IELTS Notes/Writing Exercises and Analyses.docx
+++ b/IELTS Notes/Writing Exercises and Analyses.docx
@@ -166,7 +166,6 @@
       <w:r>
         <w:rPr>
           <w:noProof/>
-          <w:lang w:val="en-US"/>
         </w:rPr>
         <w:drawing>
           <wp:inline distT="0" distB="0" distL="0" distR="0" wp14:anchorId="08977292" wp14:editId="42CCB397">
@@ -721,7 +720,6 @@
       <w:r>
         <w:rPr>
           <w:noProof/>
-          <w:lang w:val="en-US"/>
         </w:rPr>
         <w:drawing>
           <wp:inline distT="0" distB="0" distL="0" distR="0" wp14:anchorId="18EA0D2D" wp14:editId="66082D4B">
@@ -1791,7 +1789,6 @@
       <w:r>
         <w:rPr>
           <w:noProof/>
-          <w:lang w:val="en-US"/>
         </w:rPr>
         <w:drawing>
           <wp:inline distT="0" distB="0" distL="0" distR="0" wp14:anchorId="79B15416" wp14:editId="1C4FE0F3">
@@ -2805,7 +2802,6 @@
         <w:rPr>
           <w:rFonts w:ascii="Times New Roman" w:hAnsi="Times New Roman" w:cs="Times New Roman" w:hint="eastAsia"/>
           <w:noProof/>
-          <w:lang w:val="en-US"/>
         </w:rPr>
         <w:drawing>
           <wp:inline distT="0" distB="0" distL="0" distR="0" wp14:anchorId="07D1F011" wp14:editId="1BF3646A">
@@ -3142,7 +3138,6 @@
         <w:rPr>
           <w:rFonts w:ascii="Times New Roman" w:hAnsi="Times New Roman" w:cs="Times New Roman" w:hint="eastAsia"/>
           <w:noProof/>
-          <w:lang w:val="en-US"/>
         </w:rPr>
         <w:lastRenderedPageBreak/>
         <w:drawing>
@@ -3837,7 +3832,6 @@
       <w:r>
         <w:rPr>
           <w:noProof/>
-          <w:lang w:val="en-US"/>
         </w:rPr>
         <w:drawing>
           <wp:inline distT="0" distB="0" distL="0" distR="0" wp14:anchorId="1C24B181" wp14:editId="5183DFF6">
@@ -4057,7 +4051,6 @@
       <w:r>
         <w:rPr>
           <w:noProof/>
-          <w:lang w:val="en-US"/>
         </w:rPr>
         <w:lastRenderedPageBreak/>
         <w:drawing>
@@ -5298,7 +5291,6 @@
       <w:r>
         <w:rPr>
           <w:noProof/>
-          <w:lang w:val="en-US"/>
         </w:rPr>
         <w:lastRenderedPageBreak/>
         <w:drawing>
@@ -6525,7 +6517,6 @@
       <w:r>
         <w:rPr>
           <w:noProof/>
-          <w:lang w:val="en-US"/>
         </w:rPr>
         <w:drawing>
           <wp:inline distT="0" distB="0" distL="0" distR="0" wp14:anchorId="4D6B46BF" wp14:editId="5114EE27">
@@ -7853,7 +7844,7 @@
     <w:p>
       <w:pPr>
         <w:rPr>
-          <w:rFonts w:ascii="Times New Roman" w:hAnsi="Times New Roman" w:cs="Times New Roman" w:hint="eastAsia"/>
+          <w:rFonts w:ascii="Times New Roman" w:hAnsi="Times New Roman" w:cs="Times New Roman"/>
         </w:rPr>
       </w:pPr>
       <w:r>
@@ -7910,7 +7901,7 @@
     <w:p>
       <w:pPr>
         <w:rPr>
-          <w:rFonts w:ascii="Times New Roman" w:hAnsi="Times New Roman" w:cs="Times New Roman" w:hint="eastAsia"/>
+          <w:rFonts w:ascii="Times New Roman" w:hAnsi="Times New Roman" w:cs="Times New Roman"/>
           <w:b/>
           <w:i/>
         </w:rPr>
@@ -7939,8 +7930,6 @@
         </w:rPr>
         <w:t>revised edition</w:t>
       </w:r>
-      <w:bookmarkStart w:id="0" w:name="_GoBack"/>
-      <w:bookmarkEnd w:id="0"/>
       <w:r>
         <w:rPr>
           <w:rFonts w:ascii="Times New Roman" w:hAnsi="Times New Roman" w:cs="Times New Roman" w:hint="eastAsia"/>
@@ -8027,13 +8016,12 @@
     <w:p>
       <w:pPr>
         <w:rPr>
-          <w:rFonts w:ascii="Times New Roman" w:hAnsi="Times New Roman" w:cs="Times New Roman"/>
+          <w:rFonts w:ascii="Times New Roman" w:hAnsi="Times New Roman" w:cs="Times New Roman" w:hint="eastAsia"/>
         </w:rPr>
       </w:pPr>
       <w:r>
         <w:rPr>
           <w:noProof/>
-          <w:lang w:val="en-US"/>
         </w:rPr>
         <w:lastRenderedPageBreak/>
         <w:drawing>
@@ -8076,9 +8064,303 @@
     <w:p>
       <w:pPr>
         <w:rPr>
-          <w:rFonts w:ascii="Times New Roman" w:hAnsi="Times New Roman" w:cs="Times New Roman"/>
-        </w:rPr>
-      </w:pPr>
+          <w:rFonts w:ascii="Times New Roman" w:hAnsi="Times New Roman" w:cs="Times New Roman" w:hint="eastAsia"/>
+        </w:rPr>
+      </w:pPr>
+    </w:p>
+    <w:p>
+      <w:pPr>
+        <w:outlineLvl w:val="3"/>
+        <w:rPr>
+          <w:rFonts w:ascii="Times New Roman" w:hAnsi="Times New Roman" w:cs="Times New Roman"/>
+          <w:b/>
+        </w:rPr>
+      </w:pPr>
+      <w:r>
+        <w:rPr>
+          <w:rFonts w:ascii="Times New Roman" w:hAnsi="Times New Roman" w:cs="Times New Roman" w:hint="eastAsia"/>
+          <w:b/>
+        </w:rPr>
+        <w:t>3) Teenager</w:t>
+      </w:r>
+      <w:r>
+        <w:rPr>
+          <w:rFonts w:ascii="Times New Roman" w:hAnsi="Times New Roman" w:cs="Times New Roman"/>
+          <w:b/>
+        </w:rPr>
+        <w:t>’</w:t>
+      </w:r>
+      <w:r>
+        <w:rPr>
+          <w:rFonts w:ascii="Times New Roman" w:hAnsi="Times New Roman" w:cs="Times New Roman" w:hint="eastAsia"/>
+          <w:b/>
+        </w:rPr>
+        <w:t>s activities</w:t>
+      </w:r>
+    </w:p>
+    <w:p>
+      <w:pPr>
+        <w:rPr>
+          <w:rFonts w:ascii="Times New Roman" w:hAnsi="Times New Roman" w:cs="Times New Roman" w:hint="eastAsia"/>
+        </w:rPr>
+      </w:pPr>
+      <w:r>
+        <w:rPr>
+          <w:noProof/>
+        </w:rPr>
+        <w:drawing>
+          <wp:inline distT="0" distB="0" distL="0" distR="0" wp14:anchorId="05C73BA7" wp14:editId="01F88F56">
+            <wp:extent cx="5274310" cy="3798846"/>
+            <wp:effectExtent l="0" t="0" r="2540" b="0"/>
+            <wp:docPr id="5" name="图片 5"/>
+            <wp:cNvGraphicFramePr>
+              <a:graphicFrameLocks xmlns:a="http://schemas.openxmlformats.org/drawingml/2006/main" noChangeAspect="1"/>
+            </wp:cNvGraphicFramePr>
+            <a:graphic xmlns:a="http://schemas.openxmlformats.org/drawingml/2006/main">
+              <a:graphicData uri="http://schemas.openxmlformats.org/drawingml/2006/picture">
+                <pic:pic xmlns:pic="http://schemas.openxmlformats.org/drawingml/2006/picture">
+                  <pic:nvPicPr>
+                    <pic:cNvPr id="0" name=""/>
+                    <pic:cNvPicPr/>
+                  </pic:nvPicPr>
+                  <pic:blipFill>
+                    <a:blip r:embed="rId22"/>
+                    <a:stretch>
+                      <a:fillRect/>
+                    </a:stretch>
+                  </pic:blipFill>
+                  <pic:spPr>
+                    <a:xfrm>
+                      <a:off x="0" y="0"/>
+                      <a:ext cx="5274310" cy="3798846"/>
+                    </a:xfrm>
+                    <a:prstGeom prst="rect">
+                      <a:avLst/>
+                    </a:prstGeom>
+                  </pic:spPr>
+                </pic:pic>
+              </a:graphicData>
+            </a:graphic>
+          </wp:inline>
+        </w:drawing>
+      </w:r>
+    </w:p>
+    <w:p>
+      <w:pPr>
+        <w:rPr>
+          <w:rFonts w:ascii="Times New Roman" w:hAnsi="Times New Roman" w:cs="Times New Roman" w:hint="eastAsia"/>
+          <w:b/>
+          <w:i/>
+        </w:rPr>
+      </w:pPr>
+      <w:r>
+        <w:rPr>
+          <w:rFonts w:ascii="Times New Roman" w:hAnsi="Times New Roman" w:cs="Times New Roman" w:hint="eastAsia"/>
+          <w:b/>
+          <w:i/>
+        </w:rPr>
+        <w:lastRenderedPageBreak/>
+        <w:t>My Report</w:t>
+      </w:r>
+    </w:p>
+    <w:p>
+      <w:pPr>
+        <w:rPr>
+          <w:rFonts w:ascii="Times New Roman" w:hAnsi="Times New Roman" w:cs="Times New Roman" w:hint="eastAsia"/>
+        </w:rPr>
+      </w:pPr>
+      <w:r>
+        <w:rPr>
+          <w:rFonts w:ascii="Times New Roman" w:hAnsi="Times New Roman" w:cs="Times New Roman" w:hint="eastAsia"/>
+        </w:rPr>
+        <w:t>The bar chart illustrates the time each week</w:t>
+      </w:r>
+      <w:r>
+        <w:rPr>
+          <w:rFonts w:ascii="Times New Roman" w:hAnsi="Times New Roman" w:cs="Times New Roman" w:hint="eastAsia"/>
+        </w:rPr>
+        <w:t xml:space="preserve"> teenagers spent</w:t>
+      </w:r>
+      <w:r>
+        <w:rPr>
+          <w:rFonts w:ascii="Times New Roman" w:hAnsi="Times New Roman" w:cs="Times New Roman" w:hint="eastAsia"/>
+        </w:rPr>
+        <w:t xml:space="preserve"> doing seven kinds of activities in Chester in</w:t>
+      </w:r>
+      <w:r>
+        <w:rPr>
+          <w:rFonts w:ascii="Times New Roman" w:hAnsi="Times New Roman" w:cs="Times New Roman" w:hint="eastAsia"/>
+        </w:rPr>
+        <w:t xml:space="preserve"> the</w:t>
+      </w:r>
+      <w:r>
+        <w:rPr>
+          <w:rFonts w:ascii="Times New Roman" w:hAnsi="Times New Roman" w:cs="Times New Roman" w:hint="eastAsia"/>
+        </w:rPr>
+        <w:t xml:space="preserve"> years between 2002 and 2007. Units are measured in hours.</w:t>
+      </w:r>
+    </w:p>
+    <w:p>
+      <w:pPr>
+        <w:rPr>
+          <w:rFonts w:ascii="Times New Roman" w:hAnsi="Times New Roman" w:cs="Times New Roman" w:hint="eastAsia"/>
+        </w:rPr>
+      </w:pPr>
+      <w:r>
+        <w:rPr>
+          <w:rFonts w:ascii="Times New Roman" w:hAnsi="Times New Roman" w:cs="Times New Roman" w:hint="eastAsia"/>
+        </w:rPr>
+        <w:t xml:space="preserve">Overall, </w:t>
+      </w:r>
+      <w:r>
+        <w:rPr>
+          <w:rFonts w:ascii="Times New Roman" w:hAnsi="Times New Roman" w:cs="Times New Roman" w:hint="eastAsia"/>
+        </w:rPr>
+        <w:t xml:space="preserve">during the given period, </w:t>
+      </w:r>
+      <w:r>
+        <w:rPr>
+          <w:rFonts w:ascii="Times New Roman" w:hAnsi="Times New Roman" w:cs="Times New Roman" w:hint="eastAsia"/>
+        </w:rPr>
+        <w:t xml:space="preserve">watching televison </w:t>
+      </w:r>
+      <w:r>
+        <w:rPr>
+          <w:rFonts w:ascii="Times New Roman" w:hAnsi="Times New Roman" w:cs="Times New Roman" w:hint="eastAsia"/>
+        </w:rPr>
+        <w:t>was the largest amount of time</w:t>
+      </w:r>
+      <w:r>
+        <w:rPr>
+          <w:rFonts w:ascii="Times New Roman" w:hAnsi="Times New Roman" w:cs="Times New Roman" w:hint="eastAsia"/>
+        </w:rPr>
+        <w:t xml:space="preserve">, while </w:t>
+      </w:r>
+      <w:r>
+        <w:rPr>
+          <w:rFonts w:ascii="Times New Roman" w:hAnsi="Times New Roman" w:cs="Times New Roman" w:hint="eastAsia"/>
+        </w:rPr>
+        <w:t xml:space="preserve">bowling consistently </w:t>
+      </w:r>
+      <w:r>
+        <w:rPr>
+          <w:rFonts w:ascii="Times New Roman" w:hAnsi="Times New Roman" w:cs="Times New Roman" w:hint="eastAsia"/>
+        </w:rPr>
+        <w:t xml:space="preserve">was </w:t>
+      </w:r>
+      <w:r>
+        <w:rPr>
+          <w:rFonts w:ascii="Times New Roman" w:hAnsi="Times New Roman" w:cs="Times New Roman" w:hint="eastAsia"/>
+        </w:rPr>
+        <w:t xml:space="preserve">the </w:t>
+      </w:r>
+      <w:r>
+        <w:rPr>
+          <w:rFonts w:ascii="Times New Roman" w:hAnsi="Times New Roman" w:cs="Times New Roman" w:hint="eastAsia"/>
+        </w:rPr>
+        <w:t>smallest</w:t>
+      </w:r>
+      <w:r>
+        <w:rPr>
+          <w:rFonts w:ascii="Times New Roman" w:hAnsi="Times New Roman" w:cs="Times New Roman" w:hint="eastAsia"/>
+        </w:rPr>
+        <w:t>.</w:t>
+      </w:r>
+      <w:r>
+        <w:rPr>
+          <w:rFonts w:ascii="Times New Roman" w:hAnsi="Times New Roman" w:cs="Times New Roman" w:hint="eastAsia"/>
+        </w:rPr>
+        <w:t xml:space="preserve"> </w:t>
+      </w:r>
+      <w:r>
+        <w:rPr>
+          <w:rFonts w:ascii="Times New Roman" w:hAnsi="Times New Roman" w:cs="Times New Roman" w:hint="eastAsia"/>
+        </w:rPr>
+        <w:t xml:space="preserve">The amount of time spent on  going pubs or discos, watching TV and shopping were increasing. Whereas, hours consumed on doing homework, doing sport and bowling gradually. </w:t>
+      </w:r>
+    </w:p>
+    <w:p>
+      <w:pPr>
+        <w:rPr>
+          <w:rFonts w:ascii="Times New Roman" w:hAnsi="Times New Roman" w:cs="Times New Roman" w:hint="eastAsia"/>
+        </w:rPr>
+      </w:pPr>
+      <w:r>
+        <w:rPr>
+          <w:rFonts w:ascii="Times New Roman" w:hAnsi="Times New Roman" w:cs="Times New Roman" w:hint="eastAsia"/>
+        </w:rPr>
+        <w:t xml:space="preserve">In terms of watching television, it took exactly 25 hours in the first two years and then the amount rised drastically in 2004 and 2005 by 5 hours a year; the figure reached to approximately 37 hours in the final year. </w:t>
+      </w:r>
+      <w:r>
+        <w:rPr>
+          <w:rFonts w:ascii="Times New Roman" w:hAnsi="Times New Roman" w:cs="Times New Roman" w:hint="eastAsia"/>
+        </w:rPr>
+        <w:t>To be contrast</w:t>
+      </w:r>
+      <w:r>
+        <w:rPr>
+          <w:rFonts w:ascii="Times New Roman" w:hAnsi="Times New Roman" w:cs="Times New Roman" w:hint="eastAsia"/>
+        </w:rPr>
+        <w:t xml:space="preserve">, they spent less than 5 hours on bowling in 2002 and the number dropped to only an hour in 2007. </w:t>
+      </w:r>
+    </w:p>
+    <w:p>
+      <w:pPr>
+        <w:rPr>
+          <w:rFonts w:ascii="Times New Roman" w:hAnsi="Times New Roman" w:cs="Times New Roman" w:hint="eastAsia"/>
+        </w:rPr>
+      </w:pPr>
+      <w:r>
+        <w:rPr>
+          <w:rFonts w:ascii="Times New Roman" w:hAnsi="Times New Roman" w:cs="Times New Roman" w:hint="eastAsia"/>
+        </w:rPr>
+        <w:t xml:space="preserve">Whereas, the hours spent on going to pubs or discos grew steadily from 2002 to 2004 and kept steady before it increased steeply to about 17.5 hours in 2007. </w:t>
+      </w:r>
+      <w:r>
+        <w:rPr>
+          <w:rFonts w:ascii="Times New Roman" w:hAnsi="Times New Roman" w:cs="Times New Roman" w:hint="eastAsia"/>
+        </w:rPr>
+        <w:t>Time cost on shopping was over 5 hours in 2002 and increased to 15 hours in the final year.</w:t>
+      </w:r>
+      <w:r>
+        <w:rPr>
+          <w:rFonts w:ascii="Times New Roman" w:hAnsi="Times New Roman" w:cs="Times New Roman" w:hint="eastAsia"/>
+        </w:rPr>
+        <w:t xml:space="preserve"> On the contrary, the amount of time spent on doing homework head downwards from 12 hourrs in 2002 to about 7 hours in 2007. </w:t>
+      </w:r>
+      <w:r>
+        <w:rPr>
+          <w:rFonts w:ascii="Times New Roman" w:hAnsi="Times New Roman" w:cs="Times New Roman" w:hint="eastAsia"/>
+        </w:rPr>
+        <w:t xml:space="preserve">It was the same with doing sport on which the time dropped from 10 hours in the first year to 2 hours in </w:t>
+      </w:r>
+      <w:r>
+        <w:rPr>
+          <w:rFonts w:ascii="Times New Roman" w:hAnsi="Times New Roman" w:cs="Times New Roman" w:hint="eastAsia"/>
+        </w:rPr>
+        <w:t>2007</w:t>
+      </w:r>
+      <w:r>
+        <w:rPr>
+          <w:rFonts w:ascii="Times New Roman" w:hAnsi="Times New Roman" w:cs="Times New Roman" w:hint="eastAsia"/>
+        </w:rPr>
+        <w:t xml:space="preserve">. </w:t>
+      </w:r>
+    </w:p>
+    <w:p>
+      <w:pPr>
+        <w:rPr>
+          <w:rFonts w:ascii="Times New Roman" w:hAnsi="Times New Roman" w:cs="Times New Roman"/>
+        </w:rPr>
+      </w:pPr>
+      <w:r>
+        <w:rPr>
+          <w:rFonts w:ascii="Times New Roman" w:hAnsi="Times New Roman" w:cs="Times New Roman" w:hint="eastAsia"/>
+        </w:rPr>
+        <w:t>* Too many words.</w:t>
+      </w:r>
+      <w:bookmarkStart w:id="0" w:name="_GoBack"/>
+      <w:bookmarkEnd w:id="0"/>
     </w:p>
     <w:sectPr>
       <w:pgSz w:w="11906" w:h="16838"/>
@@ -11091,7 +11373,7 @@
   <a:extraClrSchemeLst/>
   <a:extLst>
     <a:ext uri="{05A4C25C-085E-4340-85A3-A5531E510DB2}">
-      <thm15:themeFamily xmlns:thm15="http://schemas.microsoft.com/office/thememl/2012/main" xmlns="" name="Office Theme" id="{62F939B6-93AF-4DB8-9C6B-D6C7DFDC589F}" vid="{4A3C46E8-61CC-4603-A589-7422A47A8E4A}"/>
+      <thm15:themeFamily xmlns="" xmlns:thm15="http://schemas.microsoft.com/office/thememl/2012/main" name="Office Theme" id="{62F939B6-93AF-4DB8-9C6B-D6C7DFDC589F}" vid="{4A3C46E8-61CC-4603-A589-7422A47A8E4A}"/>
     </a:ext>
   </a:extLst>
 </a:theme>
@@ -11102,7 +11384,7 @@
 </file>
 
 <file path=customXml/itemProps1.xml><?xml version="1.0" encoding="utf-8"?>
-<ds:datastoreItem xmlns:ds="http://schemas.openxmlformats.org/officeDocument/2006/customXml" ds:itemID="{2D1D6743-80A9-4793-B30E-1E6ADC81C4C7}">
+<ds:datastoreItem xmlns:ds="http://schemas.openxmlformats.org/officeDocument/2006/customXml" ds:itemID="{99E15310-AF18-4902-95A5-A569DF415ED1}">
   <ds:schemaRefs>
     <ds:schemaRef ds:uri="http://schemas.openxmlformats.org/officeDocument/2006/bibliography"/>
   </ds:schemaRefs>

</xml_diff>

<commit_message>
add a journal of 2025-05-15
</commit_message>
<xml_diff>
--- a/IELTS Notes/Writing Exercises and Analyses.docx
+++ b/IELTS Notes/Writing Exercises and Analyses.docx
@@ -8016,7 +8016,7 @@
     <w:p>
       <w:pPr>
         <w:rPr>
-          <w:rFonts w:ascii="Times New Roman" w:hAnsi="Times New Roman" w:cs="Times New Roman" w:hint="eastAsia"/>
+          <w:rFonts w:ascii="Times New Roman" w:hAnsi="Times New Roman" w:cs="Times New Roman"/>
         </w:rPr>
       </w:pPr>
       <w:r>
@@ -8064,7 +8064,7 @@
     <w:p>
       <w:pPr>
         <w:rPr>
-          <w:rFonts w:ascii="Times New Roman" w:hAnsi="Times New Roman" w:cs="Times New Roman" w:hint="eastAsia"/>
+          <w:rFonts w:ascii="Times New Roman" w:hAnsi="Times New Roman" w:cs="Times New Roman"/>
         </w:rPr>
       </w:pPr>
     </w:p>
@@ -8101,7 +8101,7 @@
     <w:p>
       <w:pPr>
         <w:rPr>
-          <w:rFonts w:ascii="Times New Roman" w:hAnsi="Times New Roman" w:cs="Times New Roman" w:hint="eastAsia"/>
+          <w:rFonts w:ascii="Times New Roman" w:hAnsi="Times New Roman" w:cs="Times New Roman"/>
         </w:rPr>
       </w:pPr>
       <w:r>
@@ -8148,7 +8148,7 @@
     <w:p>
       <w:pPr>
         <w:rPr>
-          <w:rFonts w:ascii="Times New Roman" w:hAnsi="Times New Roman" w:cs="Times New Roman" w:hint="eastAsia"/>
+          <w:rFonts w:ascii="Times New Roman" w:hAnsi="Times New Roman" w:cs="Times New Roman"/>
           <w:b/>
           <w:i/>
         </w:rPr>
@@ -8166,7 +8166,7 @@
     <w:p>
       <w:pPr>
         <w:rPr>
-          <w:rFonts w:ascii="Times New Roman" w:hAnsi="Times New Roman" w:cs="Times New Roman" w:hint="eastAsia"/>
+          <w:rFonts w:ascii="Times New Roman" w:hAnsi="Times New Roman" w:cs="Times New Roman"/>
         </w:rPr>
       </w:pPr>
       <w:r>
@@ -8203,7 +8203,7 @@
     <w:p>
       <w:pPr>
         <w:rPr>
-          <w:rFonts w:ascii="Times New Roman" w:hAnsi="Times New Roman" w:cs="Times New Roman" w:hint="eastAsia"/>
+          <w:rFonts w:ascii="Times New Roman" w:hAnsi="Times New Roman" w:cs="Times New Roman"/>
         </w:rPr>
       </w:pPr>
       <w:r>
@@ -8282,7 +8282,7 @@
     <w:p>
       <w:pPr>
         <w:rPr>
-          <w:rFonts w:ascii="Times New Roman" w:hAnsi="Times New Roman" w:cs="Times New Roman" w:hint="eastAsia"/>
+          <w:rFonts w:ascii="Times New Roman" w:hAnsi="Times New Roman" w:cs="Times New Roman"/>
         </w:rPr>
       </w:pPr>
       <w:r>
@@ -8307,7 +8307,7 @@
     <w:p>
       <w:pPr>
         <w:rPr>
-          <w:rFonts w:ascii="Times New Roman" w:hAnsi="Times New Roman" w:cs="Times New Roman" w:hint="eastAsia"/>
+          <w:rFonts w:ascii="Times New Roman" w:hAnsi="Times New Roman" w:cs="Times New Roman"/>
         </w:rPr>
       </w:pPr>
       <w:r>
@@ -8326,41 +8326,53 @@
         <w:rPr>
           <w:rFonts w:ascii="Times New Roman" w:hAnsi="Times New Roman" w:cs="Times New Roman" w:hint="eastAsia"/>
         </w:rPr>
-        <w:t xml:space="preserve"> On the contrary, the amount of time spent on doing homework head downwards from 12 hourrs in 2002 to about 7 hours in 2007. </w:t>
-      </w:r>
-      <w:r>
-        <w:rPr>
-          <w:rFonts w:ascii="Times New Roman" w:hAnsi="Times New Roman" w:cs="Times New Roman" w:hint="eastAsia"/>
-        </w:rPr>
-        <w:t xml:space="preserve">It was the same with doing sport on which the time dropped from 10 hours in the first year to 2 hours in </w:t>
-      </w:r>
-      <w:r>
-        <w:rPr>
-          <w:rFonts w:ascii="Times New Roman" w:hAnsi="Times New Roman" w:cs="Times New Roman" w:hint="eastAsia"/>
-        </w:rPr>
-        <w:t>2007</w:t>
-      </w:r>
-      <w:r>
-        <w:rPr>
-          <w:rFonts w:ascii="Times New Roman" w:hAnsi="Times New Roman" w:cs="Times New Roman" w:hint="eastAsia"/>
-        </w:rPr>
-        <w:t xml:space="preserve">. </w:t>
-      </w:r>
-    </w:p>
-    <w:p>
-      <w:pPr>
-        <w:rPr>
-          <w:rFonts w:ascii="Times New Roman" w:hAnsi="Times New Roman" w:cs="Times New Roman"/>
-        </w:rPr>
-      </w:pPr>
-      <w:r>
-        <w:rPr>
-          <w:rFonts w:ascii="Times New Roman" w:hAnsi="Times New Roman" w:cs="Times New Roman" w:hint="eastAsia"/>
-        </w:rPr>
-        <w:t>* Too many words.</w:t>
+        <w:t xml:space="preserve"> On the contrary, the amount of time spent on doing home</w:t>
+      </w:r>
+      <w:r>
+        <w:rPr>
+          <w:rFonts w:ascii="Times New Roman" w:hAnsi="Times New Roman" w:cs="Times New Roman" w:hint="eastAsia"/>
+        </w:rPr>
+        <w:t>work head downwards from 12 hou</w:t>
       </w:r>
       <w:bookmarkStart w:id="0" w:name="_GoBack"/>
       <w:bookmarkEnd w:id="0"/>
+      <w:r>
+        <w:rPr>
+          <w:rFonts w:ascii="Times New Roman" w:hAnsi="Times New Roman" w:cs="Times New Roman" w:hint="eastAsia"/>
+        </w:rPr>
+        <w:t xml:space="preserve">rs in 2002 to about 7 hours in 2007. </w:t>
+      </w:r>
+      <w:r>
+        <w:rPr>
+          <w:rFonts w:ascii="Times New Roman" w:hAnsi="Times New Roman" w:cs="Times New Roman" w:hint="eastAsia"/>
+        </w:rPr>
+        <w:t xml:space="preserve">It was the same with doing sport on which the time dropped from 10 hours in the first year to 2 hours in </w:t>
+      </w:r>
+      <w:r>
+        <w:rPr>
+          <w:rFonts w:ascii="Times New Roman" w:hAnsi="Times New Roman" w:cs="Times New Roman" w:hint="eastAsia"/>
+        </w:rPr>
+        <w:t>2007</w:t>
+      </w:r>
+      <w:r>
+        <w:rPr>
+          <w:rFonts w:ascii="Times New Roman" w:hAnsi="Times New Roman" w:cs="Times New Roman" w:hint="eastAsia"/>
+        </w:rPr>
+        <w:t xml:space="preserve">. </w:t>
+      </w:r>
+    </w:p>
+    <w:p>
+      <w:pPr>
+        <w:rPr>
+          <w:rFonts w:ascii="Times New Roman" w:hAnsi="Times New Roman" w:cs="Times New Roman"/>
+        </w:rPr>
+      </w:pPr>
+      <w:r>
+        <w:rPr>
+          <w:rFonts w:ascii="Times New Roman" w:hAnsi="Times New Roman" w:cs="Times New Roman" w:hint="eastAsia"/>
+        </w:rPr>
+        <w:t>* Too many words.</w:t>
+      </w:r>
     </w:p>
     <w:sectPr>
       <w:pgSz w:w="11906" w:h="16838"/>
@@ -11373,7 +11385,7 @@
   <a:extraClrSchemeLst/>
   <a:extLst>
     <a:ext uri="{05A4C25C-085E-4340-85A3-A5531E510DB2}">
-      <thm15:themeFamily xmlns="" xmlns:thm15="http://schemas.microsoft.com/office/thememl/2012/main" name="Office Theme" id="{62F939B6-93AF-4DB8-9C6B-D6C7DFDC589F}" vid="{4A3C46E8-61CC-4603-A589-7422A47A8E4A}"/>
+      <thm15:themeFamily xmlns:thm15="http://schemas.microsoft.com/office/thememl/2012/main" xmlns="" name="Office Theme" id="{62F939B6-93AF-4DB8-9C6B-D6C7DFDC589F}" vid="{4A3C46E8-61CC-4603-A589-7422A47A8E4A}"/>
     </a:ext>
   </a:extLst>
 </a:theme>
@@ -11384,7 +11396,7 @@
 </file>
 
 <file path=customXml/itemProps1.xml><?xml version="1.0" encoding="utf-8"?>
-<ds:datastoreItem xmlns:ds="http://schemas.openxmlformats.org/officeDocument/2006/customXml" ds:itemID="{99E15310-AF18-4902-95A5-A569DF415ED1}">
+<ds:datastoreItem xmlns:ds="http://schemas.openxmlformats.org/officeDocument/2006/customXml" ds:itemID="{80869ACB-3757-497A-957D-50D5867D8B76}">
   <ds:schemaRefs>
     <ds:schemaRef ds:uri="http://schemas.openxmlformats.org/officeDocument/2006/bibliography"/>
   </ds:schemaRefs>

</xml_diff>

<commit_message>
improving the report of writing task 1 - adolescents doing activities
</commit_message>
<xml_diff>
--- a/IELTS Notes/Writing Exercises and Analyses.docx
+++ b/IELTS Notes/Writing Exercises and Analyses.docx
@@ -8222,13 +8222,39 @@
         <w:rPr>
           <w:rFonts w:ascii="Times New Roman" w:hAnsi="Times New Roman" w:cs="Times New Roman" w:hint="eastAsia"/>
         </w:rPr>
-        <w:t xml:space="preserve">watching televison </w:t>
-      </w:r>
-      <w:r>
-        <w:rPr>
-          <w:rFonts w:ascii="Times New Roman" w:hAnsi="Times New Roman" w:cs="Times New Roman" w:hint="eastAsia"/>
-        </w:rPr>
-        <w:t>was the largest amount of time</w:t>
+        <w:t xml:space="preserve">watching </w:t>
+      </w:r>
+      <w:r>
+        <w:rPr>
+          <w:rFonts w:ascii="Times New Roman" w:hAnsi="Times New Roman" w:cs="Times New Roman" w:hint="eastAsia"/>
+          <w:highlight w:val="red"/>
+        </w:rPr>
+        <w:t>televison</w:t>
+      </w:r>
+      <w:r>
+        <w:rPr>
+          <w:rFonts w:ascii="Times New Roman" w:hAnsi="Times New Roman" w:cs="Times New Roman" w:hint="eastAsia"/>
+        </w:rPr>
+        <w:t>(1)</w:t>
+      </w:r>
+      <w:r>
+        <w:rPr>
+          <w:rFonts w:ascii="Times New Roman" w:hAnsi="Times New Roman" w:cs="Times New Roman" w:hint="eastAsia"/>
+        </w:rPr>
+        <w:t xml:space="preserve"> </w:t>
+      </w:r>
+      <w:r>
+        <w:rPr>
+          <w:rFonts w:ascii="Times New Roman" w:hAnsi="Times New Roman" w:cs="Times New Roman" w:hint="eastAsia"/>
+        </w:rPr>
+        <w:t xml:space="preserve">was the largest </w:t>
+      </w:r>
+      <w:r>
+        <w:rPr>
+          <w:rFonts w:ascii="Times New Roman" w:hAnsi="Times New Roman" w:cs="Times New Roman" w:hint="eastAsia"/>
+          <w:highlight w:val="darkCyan"/>
+        </w:rPr>
+        <w:t>amount of time</w:t>
       </w:r>
       <w:r>
         <w:rPr>
@@ -8275,8 +8301,65 @@
       <w:r>
         <w:rPr>
           <w:rFonts w:ascii="Times New Roman" w:hAnsi="Times New Roman" w:cs="Times New Roman" w:hint="eastAsia"/>
-        </w:rPr>
-        <w:t xml:space="preserve">The amount of time spent on  going pubs or discos, watching TV and shopping were increasing. Whereas, hours consumed on doing homework, doing sport and bowling gradually. </w:t>
+          <w:highlight w:val="darkCyan"/>
+        </w:rPr>
+        <w:t>The amount of time</w:t>
+      </w:r>
+      <w:r>
+        <w:rPr>
+          <w:rFonts w:ascii="Times New Roman" w:hAnsi="Times New Roman" w:cs="Times New Roman" w:hint="eastAsia"/>
+        </w:rPr>
+        <w:t xml:space="preserve"> spent on  </w:t>
+      </w:r>
+      <w:r>
+        <w:rPr>
+          <w:rFonts w:ascii="Times New Roman" w:hAnsi="Times New Roman" w:cs="Times New Roman" w:hint="eastAsia"/>
+          <w:highlight w:val="yellow"/>
+        </w:rPr>
+        <w:t>going pubs</w:t>
+      </w:r>
+      <w:r>
+        <w:rPr>
+          <w:rFonts w:ascii="Times New Roman" w:hAnsi="Times New Roman" w:cs="Times New Roman" w:hint="eastAsia"/>
+        </w:rPr>
+        <w:t>(2)</w:t>
+      </w:r>
+      <w:r>
+        <w:rPr>
+          <w:rFonts w:ascii="Times New Roman" w:hAnsi="Times New Roman" w:cs="Times New Roman" w:hint="eastAsia"/>
+        </w:rPr>
+        <w:t xml:space="preserve"> or discos, watching TV and shopping </w:t>
+      </w:r>
+      <w:r>
+        <w:rPr>
+          <w:rFonts w:ascii="Times New Roman" w:hAnsi="Times New Roman" w:cs="Times New Roman" w:hint="eastAsia"/>
+          <w:highlight w:val="yellow"/>
+        </w:rPr>
+        <w:t>were</w:t>
+      </w:r>
+      <w:r>
+        <w:rPr>
+          <w:rFonts w:ascii="Times New Roman" w:hAnsi="Times New Roman" w:cs="Times New Roman" w:hint="eastAsia"/>
+        </w:rPr>
+        <w:t>(3)</w:t>
+      </w:r>
+      <w:r>
+        <w:rPr>
+          <w:rFonts w:ascii="Times New Roman" w:hAnsi="Times New Roman" w:cs="Times New Roman" w:hint="eastAsia"/>
+        </w:rPr>
+        <w:t xml:space="preserve"> increasing. Whereas, hours consumed on doing homework, doing sport and bowling gradually</w:t>
+      </w:r>
+      <w:r>
+        <w:rPr>
+          <w:rFonts w:ascii="Times New Roman" w:hAnsi="Times New Roman" w:cs="Times New Roman" w:hint="eastAsia"/>
+        </w:rPr>
+        <w:t xml:space="preserve"> decreased</w:t>
+      </w:r>
+      <w:r>
+        <w:rPr>
+          <w:rFonts w:ascii="Times New Roman" w:hAnsi="Times New Roman" w:cs="Times New Roman" w:hint="eastAsia"/>
+        </w:rPr>
+        <w:t xml:space="preserve">. </w:t>
       </w:r>
     </w:p>
     <w:p>
@@ -8334,44 +8417,442 @@
         </w:rPr>
         <w:t>work head downwards from 12 hou</w:t>
       </w:r>
+      <w:r>
+        <w:rPr>
+          <w:rFonts w:ascii="Times New Roman" w:hAnsi="Times New Roman" w:cs="Times New Roman" w:hint="eastAsia"/>
+        </w:rPr>
+        <w:t xml:space="preserve">rs in 2002 to about 7 hours in 2007. </w:t>
+      </w:r>
+      <w:r>
+        <w:rPr>
+          <w:rFonts w:ascii="Times New Roman" w:hAnsi="Times New Roman" w:cs="Times New Roman" w:hint="eastAsia"/>
+        </w:rPr>
+        <w:t xml:space="preserve">It was the same with doing sport on which the time dropped from 10 hours in the first year to 2 hours in </w:t>
+      </w:r>
+      <w:r>
+        <w:rPr>
+          <w:rFonts w:ascii="Times New Roman" w:hAnsi="Times New Roman" w:cs="Times New Roman" w:hint="eastAsia"/>
+        </w:rPr>
+        <w:t>2007</w:t>
+      </w:r>
+      <w:r>
+        <w:rPr>
+          <w:rFonts w:ascii="Times New Roman" w:hAnsi="Times New Roman" w:cs="Times New Roman" w:hint="eastAsia"/>
+        </w:rPr>
+        <w:t xml:space="preserve">. </w:t>
+      </w:r>
+    </w:p>
+    <w:p>
+      <w:pPr>
+        <w:rPr>
+          <w:rFonts w:ascii="Times New Roman" w:hAnsi="Times New Roman" w:cs="Times New Roman" w:hint="eastAsia"/>
+        </w:rPr>
+      </w:pPr>
+      <w:r>
+        <w:rPr>
+          <w:rFonts w:ascii="Times New Roman" w:hAnsi="Times New Roman" w:cs="Times New Roman" w:hint="eastAsia"/>
+        </w:rPr>
+        <w:t>* Too many words.</w:t>
+      </w:r>
+    </w:p>
+    <w:p>
+      <w:pPr>
+        <w:rPr>
+          <w:rFonts w:ascii="Times New Roman" w:hAnsi="Times New Roman" w:cs="Times New Roman" w:hint="eastAsia"/>
+          <w:b/>
+          <w:i/>
+        </w:rPr>
+      </w:pPr>
+      <w:r>
+        <w:rPr>
+          <w:rFonts w:ascii="Times New Roman" w:hAnsi="Times New Roman" w:cs="Times New Roman" w:hint="eastAsia"/>
+          <w:b/>
+          <w:i/>
+        </w:rPr>
+        <w:t>Errors</w:t>
+      </w:r>
+    </w:p>
+    <w:p>
+      <w:pPr>
+        <w:pStyle w:val="a6"/>
+        <w:numPr>
+          <w:ilvl w:val="0"/>
+          <w:numId w:val="13"/>
+        </w:numPr>
+        <w:rPr>
+          <w:rFonts w:ascii="Times New Roman" w:hAnsi="Times New Roman" w:cs="Times New Roman" w:hint="eastAsia"/>
+        </w:rPr>
+      </w:pPr>
+      <w:r>
+        <w:rPr>
+          <w:rFonts w:ascii="Times New Roman" w:hAnsi="Times New Roman" w:cs="Times New Roman" w:hint="eastAsia"/>
+        </w:rPr>
+        <w:t>spelling error. television</w:t>
+      </w:r>
+    </w:p>
+    <w:p>
+      <w:pPr>
+        <w:pStyle w:val="a6"/>
+        <w:numPr>
+          <w:ilvl w:val="0"/>
+          <w:numId w:val="13"/>
+        </w:numPr>
+        <w:rPr>
+          <w:rFonts w:ascii="Times New Roman" w:hAnsi="Times New Roman" w:cs="Times New Roman" w:hint="eastAsia"/>
+        </w:rPr>
+      </w:pPr>
+      <w:r>
+        <w:rPr>
+          <w:rFonts w:ascii="Times New Roman" w:hAnsi="Times New Roman" w:cs="Times New Roman" w:hint="eastAsia"/>
+        </w:rPr>
+        <w:t xml:space="preserve">going </w:t>
+      </w:r>
+      <w:r>
+        <w:rPr>
+          <w:rFonts w:ascii="Times New Roman" w:hAnsi="Times New Roman" w:cs="Times New Roman" w:hint="eastAsia"/>
+          <w:highlight w:val="green"/>
+        </w:rPr>
+        <w:t>to</w:t>
+      </w:r>
+      <w:r>
+        <w:rPr>
+          <w:rFonts w:ascii="Times New Roman" w:hAnsi="Times New Roman" w:cs="Times New Roman" w:hint="eastAsia"/>
+        </w:rPr>
+        <w:t xml:space="preserve"> pubs</w:t>
+      </w:r>
+    </w:p>
+    <w:p>
+      <w:pPr>
+        <w:pStyle w:val="a6"/>
+        <w:numPr>
+          <w:ilvl w:val="0"/>
+          <w:numId w:val="13"/>
+        </w:numPr>
+        <w:rPr>
+          <w:rFonts w:ascii="Times New Roman" w:hAnsi="Times New Roman" w:cs="Times New Roman" w:hint="eastAsia"/>
+        </w:rPr>
+      </w:pPr>
+      <w:r>
+        <w:rPr>
+          <w:rFonts w:ascii="Times New Roman" w:hAnsi="Times New Roman" w:cs="Times New Roman" w:hint="eastAsia"/>
+        </w:rPr>
+        <w:t>was</w:t>
+      </w:r>
+    </w:p>
+    <w:p>
+      <w:pPr>
+        <w:rPr>
+          <w:rFonts w:ascii="Times New Roman" w:hAnsi="Times New Roman" w:cs="Times New Roman" w:hint="eastAsia"/>
+          <w:b/>
+          <w:i/>
+        </w:rPr>
+      </w:pPr>
+      <w:r>
+        <w:rPr>
+          <w:rFonts w:ascii="Times New Roman" w:hAnsi="Times New Roman" w:cs="Times New Roman" w:hint="eastAsia"/>
+          <w:b/>
+          <w:i/>
+        </w:rPr>
+        <w:t>Improved</w:t>
+      </w:r>
+    </w:p>
+    <w:p>
+      <w:pPr>
+        <w:rPr>
+          <w:rFonts w:ascii="Times New Roman" w:hAnsi="Times New Roman" w:cs="Times New Roman" w:hint="eastAsia"/>
+          <w:i/>
+        </w:rPr>
+      </w:pPr>
+      <w:r>
+        <w:rPr>
+          <w:rFonts w:ascii="Times New Roman" w:hAnsi="Times New Roman" w:cs="Times New Roman" w:hint="eastAsia"/>
+          <w:i/>
+        </w:rPr>
+        <w:t>Paragraph 2</w:t>
+      </w:r>
+    </w:p>
+    <w:p>
+      <w:pPr>
+        <w:pStyle w:val="a6"/>
+        <w:numPr>
+          <w:ilvl w:val="0"/>
+          <w:numId w:val="14"/>
+        </w:numPr>
+        <w:rPr>
+          <w:rFonts w:ascii="Times New Roman" w:hAnsi="Times New Roman" w:cs="Times New Roman" w:hint="eastAsia"/>
+        </w:rPr>
+      </w:pPr>
+      <w:r>
+        <w:rPr>
+          <w:rFonts w:ascii="Times New Roman" w:hAnsi="Times New Roman" w:cs="Times New Roman" w:hint="eastAsia"/>
+        </w:rPr>
+        <w:t xml:space="preserve">watching television occupied the largest amount of time, while bowling took the least. </w:t>
+      </w:r>
+    </w:p>
+    <w:p>
+      <w:pPr>
+        <w:pStyle w:val="a6"/>
+        <w:numPr>
+          <w:ilvl w:val="0"/>
+          <w:numId w:val="14"/>
+        </w:numPr>
+        <w:rPr>
+          <w:rFonts w:ascii="Times New Roman" w:hAnsi="Times New Roman" w:cs="Times New Roman" w:hint="eastAsia"/>
+        </w:rPr>
+      </w:pPr>
+      <w:r>
+        <w:rPr>
+          <w:rFonts w:ascii="Times New Roman" w:hAnsi="Times New Roman" w:cs="Times New Roman"/>
+        </w:rPr>
+        <w:t>“</w:t>
+      </w:r>
+      <w:r>
+        <w:rPr>
+          <w:rFonts w:ascii="Times New Roman" w:hAnsi="Times New Roman" w:cs="Times New Roman" w:hint="eastAsia"/>
+        </w:rPr>
+        <w:t xml:space="preserve">The amount of time spent on  going pubs or discos, watching TV and shopping </w:t>
+      </w:r>
+      <w:r>
+        <w:rPr>
+          <w:rFonts w:ascii="Times New Roman" w:hAnsi="Times New Roman" w:cs="Times New Roman" w:hint="eastAsia"/>
+          <w:u w:val="single"/>
+        </w:rPr>
+        <w:t>were increasing</w:t>
+      </w:r>
+      <w:r>
+        <w:rPr>
+          <w:rFonts w:ascii="Times New Roman" w:hAnsi="Times New Roman" w:cs="Times New Roman" w:hint="eastAsia"/>
+        </w:rPr>
+        <w:t xml:space="preserve">. Whereas, hours consumed on doing homework, doing sport and bowling gradually </w:t>
+      </w:r>
+      <w:r>
+        <w:rPr>
+          <w:rFonts w:ascii="Times New Roman" w:hAnsi="Times New Roman" w:cs="Times New Roman" w:hint="eastAsia"/>
+          <w:u w:val="single"/>
+        </w:rPr>
+        <w:t>decreased</w:t>
+      </w:r>
+      <w:r>
+        <w:rPr>
+          <w:rFonts w:ascii="Times New Roman" w:hAnsi="Times New Roman" w:cs="Times New Roman"/>
+        </w:rPr>
+        <w:t>”</w:t>
+      </w:r>
+      <w:r>
+        <w:rPr>
+          <w:rFonts w:ascii="Times New Roman" w:hAnsi="Times New Roman" w:cs="Times New Roman" w:hint="eastAsia"/>
+        </w:rPr>
+        <w:t xml:space="preserve"> </w:t>
+      </w:r>
+    </w:p>
+    <w:p>
+      <w:pPr>
+        <w:pStyle w:val="a6"/>
+        <w:rPr>
+          <w:rFonts w:ascii="Times New Roman" w:hAnsi="Times New Roman" w:cs="Times New Roman" w:hint="eastAsia"/>
+        </w:rPr>
+      </w:pPr>
+      <w:r>
+        <w:rPr>
+          <w:rFonts w:ascii="Times New Roman" w:hAnsi="Times New Roman" w:cs="Times New Roman" w:hint="eastAsia"/>
+        </w:rPr>
+        <w:t xml:space="preserve">The tense of these two sentences are inconsistent. The first one is past continuous and the second one is past simple. </w:t>
+      </w:r>
+      <w:r>
+        <w:rPr>
+          <w:rFonts w:ascii="Times New Roman" w:hAnsi="Times New Roman" w:cs="Times New Roman" w:hint="eastAsia"/>
+        </w:rPr>
+        <w:t xml:space="preserve">It is not coherent to write so. </w:t>
+      </w:r>
+      <w:r>
+        <w:rPr>
+          <w:rFonts w:ascii="Times New Roman" w:hAnsi="Times New Roman" w:cs="Times New Roman" w:hint="eastAsia"/>
+        </w:rPr>
+        <w:t xml:space="preserve">Either of the two tense </w:t>
+      </w:r>
+      <w:r>
+        <w:rPr>
+          <w:rFonts w:ascii="Times New Roman" w:hAnsi="Times New Roman" w:cs="Times New Roman" w:hint="eastAsia"/>
+        </w:rPr>
+        <w:t>is</w:t>
+      </w:r>
+      <w:r>
+        <w:rPr>
+          <w:rFonts w:ascii="Times New Roman" w:hAnsi="Times New Roman" w:cs="Times New Roman" w:hint="eastAsia"/>
+        </w:rPr>
+        <w:t xml:space="preserve"> appropriate. </w:t>
+      </w:r>
+    </w:p>
+    <w:p>
+      <w:pPr>
+        <w:pStyle w:val="a6"/>
+        <w:numPr>
+          <w:ilvl w:val="0"/>
+          <w:numId w:val="14"/>
+        </w:numPr>
+        <w:rPr>
+          <w:rFonts w:ascii="Times New Roman" w:hAnsi="Times New Roman" w:cs="Times New Roman" w:hint="eastAsia"/>
+        </w:rPr>
+      </w:pPr>
+      <w:r>
+        <w:rPr>
+          <w:rFonts w:ascii="Times New Roman" w:hAnsi="Times New Roman" w:cs="Times New Roman" w:hint="eastAsia"/>
+        </w:rPr>
+        <w:t xml:space="preserve">There are repeated words in this paragraph; </w:t>
+      </w:r>
+      <w:r>
+        <w:rPr>
+          <w:rFonts w:ascii="Times New Roman" w:hAnsi="Times New Roman" w:cs="Times New Roman"/>
+        </w:rPr>
+        <w:t>“</w:t>
+      </w:r>
+      <w:r>
+        <w:rPr>
+          <w:rFonts w:ascii="Times New Roman" w:hAnsi="Times New Roman" w:cs="Times New Roman" w:hint="eastAsia"/>
+        </w:rPr>
+        <w:t>the amount of time</w:t>
+      </w:r>
+      <w:r>
+        <w:rPr>
+          <w:rFonts w:ascii="Times New Roman" w:hAnsi="Times New Roman" w:cs="Times New Roman"/>
+        </w:rPr>
+        <w:t>”</w:t>
+      </w:r>
+      <w:r>
+        <w:rPr>
+          <w:rFonts w:ascii="Times New Roman" w:hAnsi="Times New Roman" w:cs="Times New Roman" w:hint="eastAsia"/>
+        </w:rPr>
+        <w:t xml:space="preserve"> appeared two times. It is easy to use </w:t>
+      </w:r>
+      <w:r>
+        <w:rPr>
+          <w:rFonts w:ascii="Times New Roman" w:hAnsi="Times New Roman" w:cs="Times New Roman"/>
+        </w:rPr>
+        <w:t>“</w:t>
+      </w:r>
+      <w:r>
+        <w:rPr>
+          <w:rFonts w:ascii="Times New Roman" w:hAnsi="Times New Roman" w:cs="Times New Roman" w:hint="eastAsia"/>
+        </w:rPr>
+        <w:t>hours</w:t>
+      </w:r>
+      <w:r>
+        <w:rPr>
+          <w:rFonts w:ascii="Times New Roman" w:hAnsi="Times New Roman" w:cs="Times New Roman"/>
+        </w:rPr>
+        <w:t>”</w:t>
+      </w:r>
+      <w:r>
+        <w:rPr>
+          <w:rFonts w:ascii="Times New Roman" w:hAnsi="Times New Roman" w:cs="Times New Roman" w:hint="eastAsia"/>
+        </w:rPr>
+        <w:t xml:space="preserve"> instead. </w:t>
+      </w:r>
+    </w:p>
+    <w:p>
+      <w:pPr>
+        <w:pStyle w:val="a6"/>
+        <w:rPr>
+          <w:rFonts w:ascii="Times New Roman" w:hAnsi="Times New Roman" w:cs="Times New Roman" w:hint="eastAsia"/>
+        </w:rPr>
+      </w:pPr>
+      <w:r>
+        <w:rPr>
+          <w:rFonts w:ascii="Times New Roman" w:hAnsi="Times New Roman" w:cs="Times New Roman" w:hint="eastAsia"/>
+        </w:rPr>
+        <w:t xml:space="preserve">For instance, </w:t>
+      </w:r>
+      <w:r>
+        <w:rPr>
+          <w:rFonts w:ascii="Times New Roman" w:hAnsi="Times New Roman" w:cs="Times New Roman" w:hint="eastAsia"/>
+          <w:highlight w:val="green"/>
+        </w:rPr>
+        <w:t>the hours</w:t>
+      </w:r>
+      <w:r>
+        <w:rPr>
+          <w:rFonts w:ascii="Times New Roman" w:hAnsi="Times New Roman" w:cs="Times New Roman" w:hint="eastAsia"/>
+        </w:rPr>
+        <w:t xml:space="preserve"> spent on going to pubs</w:t>
+      </w:r>
+      <w:r>
+        <w:rPr>
+          <w:rFonts w:ascii="Times New Roman" w:hAnsi="Times New Roman" w:cs="Times New Roman"/>
+        </w:rPr>
+        <w:t>…</w:t>
+      </w:r>
+    </w:p>
+    <w:p>
+      <w:pPr>
+        <w:rPr>
+          <w:rFonts w:ascii="Times New Roman" w:hAnsi="Times New Roman" w:cs="Times New Roman" w:hint="eastAsia"/>
+        </w:rPr>
+      </w:pPr>
+      <w:hyperlink r:id="rId23" w:history="1">
+        <w:r>
+          <w:rPr>
+            <w:rStyle w:val="ad"/>
+            <w:rFonts w:ascii="Times New Roman" w:hAnsi="Times New Roman" w:cs="Times New Roman" w:hint="eastAsia"/>
+          </w:rPr>
+          <w:t>A Model Answer</w:t>
+        </w:r>
+        <w:r>
+          <w:rPr>
+            <w:rStyle w:val="ad"/>
+            <w:rFonts w:ascii="Times New Roman" w:hAnsi="Times New Roman" w:cs="Times New Roman" w:hint="eastAsia"/>
+          </w:rPr>
+          <w:t xml:space="preserve"> From Liz</w:t>
+        </w:r>
+      </w:hyperlink>
       <w:bookmarkStart w:id="0" w:name="_GoBack"/>
       <w:bookmarkEnd w:id="0"/>
-      <w:r>
-        <w:rPr>
-          <w:rFonts w:ascii="Times New Roman" w:hAnsi="Times New Roman" w:cs="Times New Roman" w:hint="eastAsia"/>
-        </w:rPr>
-        <w:t xml:space="preserve">rs in 2002 to about 7 hours in 2007. </w:t>
-      </w:r>
-      <w:r>
-        <w:rPr>
-          <w:rFonts w:ascii="Times New Roman" w:hAnsi="Times New Roman" w:cs="Times New Roman" w:hint="eastAsia"/>
-        </w:rPr>
-        <w:t xml:space="preserve">It was the same with doing sport on which the time dropped from 10 hours in the first year to 2 hours in </w:t>
-      </w:r>
-      <w:r>
-        <w:rPr>
-          <w:rFonts w:ascii="Times New Roman" w:hAnsi="Times New Roman" w:cs="Times New Roman" w:hint="eastAsia"/>
-        </w:rPr>
-        <w:t>2007</w:t>
-      </w:r>
-      <w:r>
-        <w:rPr>
-          <w:rFonts w:ascii="Times New Roman" w:hAnsi="Times New Roman" w:cs="Times New Roman" w:hint="eastAsia"/>
-        </w:rPr>
-        <w:t xml:space="preserve">. </w:t>
-      </w:r>
-    </w:p>
-    <w:p>
-      <w:pPr>
-        <w:rPr>
-          <w:rFonts w:ascii="Times New Roman" w:hAnsi="Times New Roman" w:cs="Times New Roman"/>
-        </w:rPr>
-      </w:pPr>
-      <w:r>
-        <w:rPr>
-          <w:rFonts w:ascii="Times New Roman" w:hAnsi="Times New Roman" w:cs="Times New Roman" w:hint="eastAsia"/>
-        </w:rPr>
-        <w:t>* Too many words.</w:t>
+    </w:p>
+    <w:p>
+      <w:pPr>
+        <w:rPr>
+          <w:rFonts w:ascii="Times New Roman" w:hAnsi="Times New Roman" w:cs="Times New Roman"/>
+        </w:rPr>
+      </w:pPr>
+      <w:r>
+        <w:rPr>
+          <w:noProof/>
+        </w:rPr>
+        <w:lastRenderedPageBreak/>
+        <w:drawing>
+          <wp:inline distT="0" distB="0" distL="0" distR="0" wp14:anchorId="2320CFCA" wp14:editId="4B75FB0A">
+            <wp:extent cx="5274310" cy="4205408"/>
+            <wp:effectExtent l="0" t="0" r="2540" b="5080"/>
+            <wp:docPr id="6" name="图片 6"/>
+            <wp:cNvGraphicFramePr>
+              <a:graphicFrameLocks xmlns:a="http://schemas.openxmlformats.org/drawingml/2006/main" noChangeAspect="1"/>
+            </wp:cNvGraphicFramePr>
+            <a:graphic xmlns:a="http://schemas.openxmlformats.org/drawingml/2006/main">
+              <a:graphicData uri="http://schemas.openxmlformats.org/drawingml/2006/picture">
+                <pic:pic xmlns:pic="http://schemas.openxmlformats.org/drawingml/2006/picture">
+                  <pic:nvPicPr>
+                    <pic:cNvPr id="0" name=""/>
+                    <pic:cNvPicPr/>
+                  </pic:nvPicPr>
+                  <pic:blipFill>
+                    <a:blip r:embed="rId24"/>
+                    <a:stretch>
+                      <a:fillRect/>
+                    </a:stretch>
+                  </pic:blipFill>
+                  <pic:spPr>
+                    <a:xfrm>
+                      <a:off x="0" y="0"/>
+                      <a:ext cx="5274310" cy="4205408"/>
+                    </a:xfrm>
+                    <a:prstGeom prst="rect">
+                      <a:avLst/>
+                    </a:prstGeom>
+                  </pic:spPr>
+                </pic:pic>
+              </a:graphicData>
+            </a:graphic>
+          </wp:inline>
+        </w:drawing>
       </w:r>
     </w:p>
     <w:sectPr>
@@ -8437,6 +8918,95 @@
 <file path=word/numbering.xml><?xml version="1.0" encoding="utf-8"?>
 <w:numbering xmlns:wpc="http://schemas.microsoft.com/office/word/2010/wordprocessingCanvas" xmlns:mc="http://schemas.openxmlformats.org/markup-compatibility/2006" xmlns:o="urn:schemas-microsoft-com:office:office" xmlns:r="http://schemas.openxmlformats.org/officeDocument/2006/relationships" xmlns:m="http://schemas.openxmlformats.org/officeDocument/2006/math" xmlns:v="urn:schemas-microsoft-com:vml" xmlns:wp14="http://schemas.microsoft.com/office/word/2010/wordprocessingDrawing" xmlns:wp="http://schemas.openxmlformats.org/drawingml/2006/wordprocessingDrawing" xmlns:w10="urn:schemas-microsoft-com:office:word" xmlns:w="http://schemas.openxmlformats.org/wordprocessingml/2006/main" xmlns:w14="http://schemas.microsoft.com/office/word/2010/wordml" xmlns:wpg="http://schemas.microsoft.com/office/word/2010/wordprocessingGroup" xmlns:wpi="http://schemas.microsoft.com/office/word/2010/wordprocessingInk" xmlns:wne="http://schemas.microsoft.com/office/word/2006/wordml" xmlns:wps="http://schemas.microsoft.com/office/word/2010/wordprocessingShape" mc:Ignorable="w14 wp14">
   <w:abstractNum w:abstractNumId="0">
+    <w:nsid w:val="03B86C49"/>
+    <w:multiLevelType w:val="hybridMultilevel"/>
+    <w:tmpl w:val="23F0FABE"/>
+    <w:lvl w:ilvl="0" w:tplc="A4B0943A">
+      <w:start w:val="1"/>
+      <w:numFmt w:val="decimal"/>
+      <w:lvlText w:val="(%1)"/>
+      <w:lvlJc w:val="left"/>
+      <w:pPr>
+        <w:ind w:left="720" w:hanging="360"/>
+      </w:pPr>
+      <w:rPr>
+        <w:rFonts w:hint="default"/>
+      </w:rPr>
+    </w:lvl>
+    <w:lvl w:ilvl="1" w:tplc="08090019" w:tentative="1">
+      <w:start w:val="1"/>
+      <w:numFmt w:val="lowerLetter"/>
+      <w:lvlText w:val="%2."/>
+      <w:lvlJc w:val="left"/>
+      <w:pPr>
+        <w:ind w:left="1440" w:hanging="360"/>
+      </w:pPr>
+    </w:lvl>
+    <w:lvl w:ilvl="2" w:tplc="0809001B" w:tentative="1">
+      <w:start w:val="1"/>
+      <w:numFmt w:val="lowerRoman"/>
+      <w:lvlText w:val="%3."/>
+      <w:lvlJc w:val="right"/>
+      <w:pPr>
+        <w:ind w:left="2160" w:hanging="180"/>
+      </w:pPr>
+    </w:lvl>
+    <w:lvl w:ilvl="3" w:tplc="0809000F" w:tentative="1">
+      <w:start w:val="1"/>
+      <w:numFmt w:val="decimal"/>
+      <w:lvlText w:val="%4."/>
+      <w:lvlJc w:val="left"/>
+      <w:pPr>
+        <w:ind w:left="2880" w:hanging="360"/>
+      </w:pPr>
+    </w:lvl>
+    <w:lvl w:ilvl="4" w:tplc="08090019" w:tentative="1">
+      <w:start w:val="1"/>
+      <w:numFmt w:val="lowerLetter"/>
+      <w:lvlText w:val="%5."/>
+      <w:lvlJc w:val="left"/>
+      <w:pPr>
+        <w:ind w:left="3600" w:hanging="360"/>
+      </w:pPr>
+    </w:lvl>
+    <w:lvl w:ilvl="5" w:tplc="0809001B" w:tentative="1">
+      <w:start w:val="1"/>
+      <w:numFmt w:val="lowerRoman"/>
+      <w:lvlText w:val="%6."/>
+      <w:lvlJc w:val="right"/>
+      <w:pPr>
+        <w:ind w:left="4320" w:hanging="180"/>
+      </w:pPr>
+    </w:lvl>
+    <w:lvl w:ilvl="6" w:tplc="0809000F" w:tentative="1">
+      <w:start w:val="1"/>
+      <w:numFmt w:val="decimal"/>
+      <w:lvlText w:val="%7."/>
+      <w:lvlJc w:val="left"/>
+      <w:pPr>
+        <w:ind w:left="5040" w:hanging="360"/>
+      </w:pPr>
+    </w:lvl>
+    <w:lvl w:ilvl="7" w:tplc="08090019" w:tentative="1">
+      <w:start w:val="1"/>
+      <w:numFmt w:val="lowerLetter"/>
+      <w:lvlText w:val="%8."/>
+      <w:lvlJc w:val="left"/>
+      <w:pPr>
+        <w:ind w:left="5760" w:hanging="360"/>
+      </w:pPr>
+    </w:lvl>
+    <w:lvl w:ilvl="8" w:tplc="0809001B" w:tentative="1">
+      <w:start w:val="1"/>
+      <w:numFmt w:val="lowerRoman"/>
+      <w:lvlText w:val="%9."/>
+      <w:lvlJc w:val="right"/>
+      <w:pPr>
+        <w:ind w:left="6480" w:hanging="180"/>
+      </w:pPr>
+    </w:lvl>
+  </w:abstractNum>
+  <w:abstractNum w:abstractNumId="1">
     <w:nsid w:val="049D2E71"/>
     <w:multiLevelType w:val="hybridMultilevel"/>
     <w:tmpl w:val="D0D4D2B4"/>
@@ -8522,7 +9092,7 @@
       </w:pPr>
     </w:lvl>
   </w:abstractNum>
-  <w:abstractNum w:abstractNumId="1">
+  <w:abstractNum w:abstractNumId="2">
     <w:nsid w:val="05E6080A"/>
     <w:multiLevelType w:val="hybridMultilevel"/>
     <w:tmpl w:val="6CA8D9EA"/>
@@ -8611,7 +9181,7 @@
       </w:pPr>
     </w:lvl>
   </w:abstractNum>
-  <w:abstractNum w:abstractNumId="2">
+  <w:abstractNum w:abstractNumId="3">
     <w:nsid w:val="172641D0"/>
     <w:multiLevelType w:val="hybridMultilevel"/>
     <w:tmpl w:val="16A8839E"/>
@@ -8700,7 +9270,7 @@
       </w:pPr>
     </w:lvl>
   </w:abstractNum>
-  <w:abstractNum w:abstractNumId="3">
+  <w:abstractNum w:abstractNumId="4">
     <w:nsid w:val="1B141171"/>
     <w:multiLevelType w:val="hybridMultilevel"/>
     <w:tmpl w:val="849237CE"/>
@@ -8789,7 +9359,7 @@
       </w:pPr>
     </w:lvl>
   </w:abstractNum>
-  <w:abstractNum w:abstractNumId="4">
+  <w:abstractNum w:abstractNumId="5">
     <w:nsid w:val="2704799B"/>
     <w:multiLevelType w:val="hybridMultilevel"/>
     <w:tmpl w:val="8B20E512"/>
@@ -8878,7 +9448,7 @@
       </w:pPr>
     </w:lvl>
   </w:abstractNum>
-  <w:abstractNum w:abstractNumId="5">
+  <w:abstractNum w:abstractNumId="6">
     <w:nsid w:val="32C6166E"/>
     <w:multiLevelType w:val="hybridMultilevel"/>
     <w:tmpl w:val="83ACFECA"/>
@@ -8967,7 +9537,7 @@
       </w:pPr>
     </w:lvl>
   </w:abstractNum>
-  <w:abstractNum w:abstractNumId="6">
+  <w:abstractNum w:abstractNumId="7">
     <w:nsid w:val="43793BBF"/>
     <w:multiLevelType w:val="hybridMultilevel"/>
     <w:tmpl w:val="FD80CCB2"/>
@@ -9056,7 +9626,7 @@
       </w:pPr>
     </w:lvl>
   </w:abstractNum>
-  <w:abstractNum w:abstractNumId="7">
+  <w:abstractNum w:abstractNumId="8">
     <w:nsid w:val="50115F06"/>
     <w:multiLevelType w:val="hybridMultilevel"/>
     <w:tmpl w:val="C9CC45C4"/>
@@ -9145,7 +9715,7 @@
       </w:pPr>
     </w:lvl>
   </w:abstractNum>
-  <w:abstractNum w:abstractNumId="8">
+  <w:abstractNum w:abstractNumId="9">
     <w:nsid w:val="5FE6397B"/>
     <w:multiLevelType w:val="hybridMultilevel"/>
     <w:tmpl w:val="54860AC4"/>
@@ -9234,7 +9804,7 @@
       </w:pPr>
     </w:lvl>
   </w:abstractNum>
-  <w:abstractNum w:abstractNumId="9">
+  <w:abstractNum w:abstractNumId="10">
     <w:nsid w:val="601547E7"/>
     <w:multiLevelType w:val="hybridMultilevel"/>
     <w:tmpl w:val="655C1B72"/>
@@ -9323,7 +9893,7 @@
       </w:pPr>
     </w:lvl>
   </w:abstractNum>
-  <w:abstractNum w:abstractNumId="10">
+  <w:abstractNum w:abstractNumId="11">
     <w:nsid w:val="6E4805E5"/>
     <w:multiLevelType w:val="hybridMultilevel"/>
     <w:tmpl w:val="AD7CDE70"/>
@@ -9412,7 +9982,7 @@
       </w:pPr>
     </w:lvl>
   </w:abstractNum>
-  <w:abstractNum w:abstractNumId="11">
+  <w:abstractNum w:abstractNumId="12">
     <w:nsid w:val="74703310"/>
     <w:multiLevelType w:val="hybridMultilevel"/>
     <w:tmpl w:val="A4CEF8F8"/>
@@ -9501,41 +10071,136 @@
       </w:pPr>
     </w:lvl>
   </w:abstractNum>
+  <w:abstractNum w:abstractNumId="13">
+    <w:nsid w:val="74ED66FC"/>
+    <w:multiLevelType w:val="hybridMultilevel"/>
+    <w:tmpl w:val="0E9AA26A"/>
+    <w:lvl w:ilvl="0" w:tplc="08090011">
+      <w:start w:val="1"/>
+      <w:numFmt w:val="decimal"/>
+      <w:lvlText w:val="%1)"/>
+      <w:lvlJc w:val="left"/>
+      <w:pPr>
+        <w:ind w:left="720" w:hanging="360"/>
+      </w:pPr>
+      <w:rPr>
+        <w:rFonts w:hint="default"/>
+      </w:rPr>
+    </w:lvl>
+    <w:lvl w:ilvl="1" w:tplc="08090019" w:tentative="1">
+      <w:start w:val="1"/>
+      <w:numFmt w:val="lowerLetter"/>
+      <w:lvlText w:val="%2."/>
+      <w:lvlJc w:val="left"/>
+      <w:pPr>
+        <w:ind w:left="1440" w:hanging="360"/>
+      </w:pPr>
+    </w:lvl>
+    <w:lvl w:ilvl="2" w:tplc="0809001B" w:tentative="1">
+      <w:start w:val="1"/>
+      <w:numFmt w:val="lowerRoman"/>
+      <w:lvlText w:val="%3."/>
+      <w:lvlJc w:val="right"/>
+      <w:pPr>
+        <w:ind w:left="2160" w:hanging="180"/>
+      </w:pPr>
+    </w:lvl>
+    <w:lvl w:ilvl="3" w:tplc="0809000F" w:tentative="1">
+      <w:start w:val="1"/>
+      <w:numFmt w:val="decimal"/>
+      <w:lvlText w:val="%4."/>
+      <w:lvlJc w:val="left"/>
+      <w:pPr>
+        <w:ind w:left="2880" w:hanging="360"/>
+      </w:pPr>
+    </w:lvl>
+    <w:lvl w:ilvl="4" w:tplc="08090019" w:tentative="1">
+      <w:start w:val="1"/>
+      <w:numFmt w:val="lowerLetter"/>
+      <w:lvlText w:val="%5."/>
+      <w:lvlJc w:val="left"/>
+      <w:pPr>
+        <w:ind w:left="3600" w:hanging="360"/>
+      </w:pPr>
+    </w:lvl>
+    <w:lvl w:ilvl="5" w:tplc="0809001B" w:tentative="1">
+      <w:start w:val="1"/>
+      <w:numFmt w:val="lowerRoman"/>
+      <w:lvlText w:val="%6."/>
+      <w:lvlJc w:val="right"/>
+      <w:pPr>
+        <w:ind w:left="4320" w:hanging="180"/>
+      </w:pPr>
+    </w:lvl>
+    <w:lvl w:ilvl="6" w:tplc="0809000F" w:tentative="1">
+      <w:start w:val="1"/>
+      <w:numFmt w:val="decimal"/>
+      <w:lvlText w:val="%7."/>
+      <w:lvlJc w:val="left"/>
+      <w:pPr>
+        <w:ind w:left="5040" w:hanging="360"/>
+      </w:pPr>
+    </w:lvl>
+    <w:lvl w:ilvl="7" w:tplc="08090019" w:tentative="1">
+      <w:start w:val="1"/>
+      <w:numFmt w:val="lowerLetter"/>
+      <w:lvlText w:val="%8."/>
+      <w:lvlJc w:val="left"/>
+      <w:pPr>
+        <w:ind w:left="5760" w:hanging="360"/>
+      </w:pPr>
+    </w:lvl>
+    <w:lvl w:ilvl="8" w:tplc="0809001B" w:tentative="1">
+      <w:start w:val="1"/>
+      <w:numFmt w:val="lowerRoman"/>
+      <w:lvlText w:val="%9."/>
+      <w:lvlJc w:val="right"/>
+      <w:pPr>
+        <w:ind w:left="6480" w:hanging="180"/>
+      </w:pPr>
+    </w:lvl>
+  </w:abstractNum>
   <w:num w:numId="1">
+    <w:abstractNumId w:val="2"/>
+  </w:num>
+  <w:num w:numId="2">
+    <w:abstractNumId w:val="12"/>
+  </w:num>
+  <w:num w:numId="3">
+    <w:abstractNumId w:val="9"/>
+  </w:num>
+  <w:num w:numId="4">
+    <w:abstractNumId w:val="4"/>
+  </w:num>
+  <w:num w:numId="5">
+    <w:abstractNumId w:val="5"/>
+  </w:num>
+  <w:num w:numId="6">
     <w:abstractNumId w:val="1"/>
   </w:num>
-  <w:num w:numId="2">
+  <w:num w:numId="7">
+    <w:abstractNumId w:val="3"/>
+  </w:num>
+  <w:num w:numId="8">
+    <w:abstractNumId w:val="10"/>
+  </w:num>
+  <w:num w:numId="9">
+    <w:abstractNumId w:val="6"/>
+  </w:num>
+  <w:num w:numId="10">
     <w:abstractNumId w:val="11"/>
   </w:num>
-  <w:num w:numId="3">
+  <w:num w:numId="11">
     <w:abstractNumId w:val="8"/>
   </w:num>
-  <w:num w:numId="4">
-    <w:abstractNumId w:val="3"/>
+  <w:num w:numId="12">
+    <w:abstractNumId w:val="7"/>
   </w:num>
-  <w:num w:numId="5">
-    <w:abstractNumId w:val="4"/>
-  </w:num>
-  <w:num w:numId="6">
+  <w:num w:numId="13">
     <w:abstractNumId w:val="0"/>
   </w:num>
-  <w:num w:numId="7">
-    <w:abstractNumId w:val="2"/>
-  </w:num>
-  <w:num w:numId="8">
-    <w:abstractNumId w:val="9"/>
-  </w:num>
-  <w:num w:numId="9">
-    <w:abstractNumId w:val="5"/>
-  </w:num>
-  <w:num w:numId="10">
-    <w:abstractNumId w:val="10"/>
-  </w:num>
-  <w:num w:numId="11">
-    <w:abstractNumId w:val="7"/>
-  </w:num>
-  <w:num w:numId="12">
-    <w:abstractNumId w:val="6"/>
+  <w:num w:numId="14">
+    <w:abstractNumId w:val="13"/>
   </w:num>
 </w:numbering>
 </file>
@@ -11385,7 +12050,7 @@
   <a:extraClrSchemeLst/>
   <a:extLst>
     <a:ext uri="{05A4C25C-085E-4340-85A3-A5531E510DB2}">
-      <thm15:themeFamily xmlns:thm15="http://schemas.microsoft.com/office/thememl/2012/main" xmlns="" name="Office Theme" id="{62F939B6-93AF-4DB8-9C6B-D6C7DFDC589F}" vid="{4A3C46E8-61CC-4603-A589-7422A47A8E4A}"/>
+      <thm15:themeFamily xmlns="" xmlns:thm15="http://schemas.microsoft.com/office/thememl/2012/main" name="Office Theme" id="{62F939B6-93AF-4DB8-9C6B-D6C7DFDC589F}" vid="{4A3C46E8-61CC-4603-A589-7422A47A8E4A}"/>
     </a:ext>
   </a:extLst>
 </a:theme>
@@ -11396,7 +12061,7 @@
 </file>
 
 <file path=customXml/itemProps1.xml><?xml version="1.0" encoding="utf-8"?>
-<ds:datastoreItem xmlns:ds="http://schemas.openxmlformats.org/officeDocument/2006/customXml" ds:itemID="{80869ACB-3757-497A-957D-50D5867D8B76}">
+<ds:datastoreItem xmlns:ds="http://schemas.openxmlformats.org/officeDocument/2006/customXml" ds:itemID="{80F049CF-C264-4D8F-9309-C8495DB1335A}">
   <ds:schemaRefs>
     <ds:schemaRef ds:uri="http://schemas.openxmlformats.org/officeDocument/2006/bibliography"/>
   </ds:schemaRefs>

</xml_diff>